<commit_message>
Processos de negócio inseridos em formato de imagem
</commit_message>
<xml_diff>
--- a/Requisitos/Documentos de Casos de Uso/CSU01 - ManterSolicitacaoEntrega.docx
+++ b/Requisitos/Documentos de Casos de Uso/CSU01 - ManterSolicitacaoEntrega.docx
@@ -1,6 +1,6 @@
 
 <file path=word/document.xml><?xml version="1.0" encoding="utf-8"?>
-<w:document xmlns:wpc="http://schemas.microsoft.com/office/word/2010/wordprocessingCanvas" xmlns:mc="http://schemas.openxmlformats.org/markup-compatibility/2006" xmlns:o="urn:schemas-microsoft-com:office:office" xmlns:r="http://schemas.openxmlformats.org/officeDocument/2006/relationships" xmlns:m="http://schemas.openxmlformats.org/officeDocument/2006/math" xmlns:v="urn:schemas-microsoft-com:vml" xmlns:wp14="http://schemas.microsoft.com/office/word/2010/wordprocessingDrawing" xmlns:wp="http://schemas.openxmlformats.org/drawingml/2006/wordprocessingDrawing" xmlns:w10="urn:schemas-microsoft-com:office:word" xmlns:w="http://schemas.openxmlformats.org/wordprocessingml/2006/main" xmlns:w14="http://schemas.microsoft.com/office/word/2010/wordml" xmlns:w15="http://schemas.microsoft.com/office/word/2012/wordml" xmlns:wpg="http://schemas.microsoft.com/office/word/2010/wordprocessingGroup" xmlns:wpi="http://schemas.microsoft.com/office/word/2010/wordprocessingInk" xmlns:wne="http://schemas.microsoft.com/office/word/2006/wordml" xmlns:wps="http://schemas.microsoft.com/office/word/2010/wordprocessingShape" mc:Ignorable="w14 w15 wp14">
+<w:document xmlns:wpc="http://schemas.microsoft.com/office/word/2010/wordprocessingCanvas" xmlns:cx="http://schemas.microsoft.com/office/drawing/2014/chartex" xmlns:cx1="http://schemas.microsoft.com/office/drawing/2015/9/8/chartex" xmlns:cx2="http://schemas.microsoft.com/office/drawing/2015/10/21/chartex" xmlns:cx3="http://schemas.microsoft.com/office/drawing/2016/5/9/chartex" xmlns:cx4="http://schemas.microsoft.com/office/drawing/2016/5/10/chartex" xmlns:cx5="http://schemas.microsoft.com/office/drawing/2016/5/11/chartex" xmlns:cx6="http://schemas.microsoft.com/office/drawing/2016/5/12/chartex" xmlns:cx7="http://schemas.microsoft.com/office/drawing/2016/5/13/chartex" xmlns:cx8="http://schemas.microsoft.com/office/drawing/2016/5/14/chartex" xmlns:mc="http://schemas.openxmlformats.org/markup-compatibility/2006" xmlns:aink="http://schemas.microsoft.com/office/drawing/2016/ink" xmlns:am3d="http://schemas.microsoft.com/office/drawing/2017/model3d" xmlns:o="urn:schemas-microsoft-com:office:office" xmlns:oel="http://schemas.microsoft.com/office/2019/extlst" xmlns:r="http://schemas.openxmlformats.org/officeDocument/2006/relationships" xmlns:m="http://schemas.openxmlformats.org/officeDocument/2006/math" xmlns:v="urn:schemas-microsoft-com:vml" xmlns:wp14="http://schemas.microsoft.com/office/word/2010/wordprocessingDrawing" xmlns:wp="http://schemas.openxmlformats.org/drawingml/2006/wordprocessingDrawing" xmlns:w10="urn:schemas-microsoft-com:office:word" xmlns:w="http://schemas.openxmlformats.org/wordprocessingml/2006/main" xmlns:w14="http://schemas.microsoft.com/office/word/2010/wordml" xmlns:w15="http://schemas.microsoft.com/office/word/2012/wordml" xmlns:w16cex="http://schemas.microsoft.com/office/word/2018/wordml/cex" xmlns:w16cid="http://schemas.microsoft.com/office/word/2016/wordml/cid" xmlns:w16="http://schemas.microsoft.com/office/word/2018/wordml" xmlns:w16du="http://schemas.microsoft.com/office/word/2023/wordml/word16du" xmlns:w16sdtdh="http://schemas.microsoft.com/office/word/2020/wordml/sdtdatahash" xmlns:w16sdtfl="http://schemas.microsoft.com/office/word/2024/wordml/sdtformatlock" xmlns:w16se="http://schemas.microsoft.com/office/word/2015/wordml/symex" xmlns:wpg="http://schemas.microsoft.com/office/word/2010/wordprocessingGroup" xmlns:wpi="http://schemas.microsoft.com/office/word/2010/wordprocessingInk" xmlns:wne="http://schemas.microsoft.com/office/word/2006/wordml" xmlns:wps="http://schemas.microsoft.com/office/word/2010/wordprocessingShape" mc:Ignorable="w14 w15 w16se w16cid w16 w16cex w16sdtdh w16sdtfl w16du wp14">
   <w:body>
     <w:p>
       <w:pPr>
@@ -180,7 +180,6 @@
                 <w:sz w:val="28"/>
               </w:rPr>
             </w:pPr>
-            <w:bookmarkStart w:id="0" w:name="_GoBack"/>
             <w:r>
               <w:rPr>
                 <w:b/>
@@ -217,7 +216,6 @@
           </w:p>
         </w:tc>
       </w:tr>
-      <w:bookmarkEnd w:id="0"/>
       <w:tr>
         <w:trPr>
           <w:trHeight w:val="318"/>
@@ -873,10 +871,7 @@
               <w:t>):</w:t>
             </w:r>
             <w:r>
-              <w:t xml:space="preserve"> disparado a qualquer momento antes da entrega ser concluída; se já houve pagamento, acion</w:t>
-            </w:r>
-            <w:r>
-              <w:t xml:space="preserve">a </w:t>
+              <w:t xml:space="preserve"> disparado a qualquer momento antes da entrega ser concluída; se já houve pagamento, aciona </w:t>
             </w:r>
             <w:proofErr w:type="spellStart"/>
             <w:r>
@@ -1152,7 +1147,6 @@
               <w:jc w:val="center"/>
             </w:pPr>
             <w:r>
-              <w:lastRenderedPageBreak/>
               <w:t>10/09/2009</w:t>
             </w:r>
           </w:p>
@@ -1220,6 +1214,7 @@
               <w:jc w:val="center"/>
             </w:pPr>
             <w:r>
+              <w:lastRenderedPageBreak/>
               <w:t>19/12/2014</w:t>
             </w:r>
           </w:p>
@@ -1417,7 +1412,7 @@
 </file>
 
 <file path=word/numbering.xml><?xml version="1.0" encoding="utf-8"?>
-<w:numbering xmlns:wpc="http://schemas.microsoft.com/office/word/2010/wordprocessingCanvas" xmlns:mc="http://schemas.openxmlformats.org/markup-compatibility/2006" xmlns:o="urn:schemas-microsoft-com:office:office" xmlns:r="http://schemas.openxmlformats.org/officeDocument/2006/relationships" xmlns:m="http://schemas.openxmlformats.org/officeDocument/2006/math" xmlns:v="urn:schemas-microsoft-com:vml" xmlns:wp14="http://schemas.microsoft.com/office/word/2010/wordprocessingDrawing" xmlns:wp="http://schemas.openxmlformats.org/drawingml/2006/wordprocessingDrawing" xmlns:w10="urn:schemas-microsoft-com:office:word" xmlns:w="http://schemas.openxmlformats.org/wordprocessingml/2006/main" xmlns:w14="http://schemas.microsoft.com/office/word/2010/wordml" xmlns:w15="http://schemas.microsoft.com/office/word/2012/wordml" xmlns:wpg="http://schemas.microsoft.com/office/word/2010/wordprocessingGroup" xmlns:wpi="http://schemas.microsoft.com/office/word/2010/wordprocessingInk" xmlns:wne="http://schemas.microsoft.com/office/word/2006/wordml" xmlns:wps="http://schemas.microsoft.com/office/word/2010/wordprocessingShape" mc:Ignorable="w14 w15 wp14">
+<w:numbering xmlns:wpc="http://schemas.microsoft.com/office/word/2010/wordprocessingCanvas" xmlns:cx="http://schemas.microsoft.com/office/drawing/2014/chartex" xmlns:cx1="http://schemas.microsoft.com/office/drawing/2015/9/8/chartex" xmlns:cx2="http://schemas.microsoft.com/office/drawing/2015/10/21/chartex" xmlns:cx3="http://schemas.microsoft.com/office/drawing/2016/5/9/chartex" xmlns:cx4="http://schemas.microsoft.com/office/drawing/2016/5/10/chartex" xmlns:cx5="http://schemas.microsoft.com/office/drawing/2016/5/11/chartex" xmlns:cx6="http://schemas.microsoft.com/office/drawing/2016/5/12/chartex" xmlns:cx7="http://schemas.microsoft.com/office/drawing/2016/5/13/chartex" xmlns:cx8="http://schemas.microsoft.com/office/drawing/2016/5/14/chartex" xmlns:mc="http://schemas.openxmlformats.org/markup-compatibility/2006" xmlns:aink="http://schemas.microsoft.com/office/drawing/2016/ink" xmlns:am3d="http://schemas.microsoft.com/office/drawing/2017/model3d" xmlns:o="urn:schemas-microsoft-com:office:office" xmlns:oel="http://schemas.microsoft.com/office/2019/extlst" xmlns:r="http://schemas.openxmlformats.org/officeDocument/2006/relationships" xmlns:m="http://schemas.openxmlformats.org/officeDocument/2006/math" xmlns:v="urn:schemas-microsoft-com:vml" xmlns:wp14="http://schemas.microsoft.com/office/word/2010/wordprocessingDrawing" xmlns:wp="http://schemas.openxmlformats.org/drawingml/2006/wordprocessingDrawing" xmlns:w10="urn:schemas-microsoft-com:office:word" xmlns:w="http://schemas.openxmlformats.org/wordprocessingml/2006/main" xmlns:w14="http://schemas.microsoft.com/office/word/2010/wordml" xmlns:w15="http://schemas.microsoft.com/office/word/2012/wordml" xmlns:w16cex="http://schemas.microsoft.com/office/word/2018/wordml/cex" xmlns:w16cid="http://schemas.microsoft.com/office/word/2016/wordml/cid" xmlns:w16="http://schemas.microsoft.com/office/word/2018/wordml" xmlns:w16du="http://schemas.microsoft.com/office/word/2023/wordml/word16du" xmlns:w16sdtdh="http://schemas.microsoft.com/office/word/2020/wordml/sdtdatahash" xmlns:w16sdtfl="http://schemas.microsoft.com/office/word/2024/wordml/sdtformatlock" xmlns:w16se="http://schemas.microsoft.com/office/word/2015/wordml/symex" xmlns:wpg="http://schemas.microsoft.com/office/word/2010/wordprocessingGroup" xmlns:wpi="http://schemas.microsoft.com/office/word/2010/wordprocessingInk" xmlns:wne="http://schemas.microsoft.com/office/word/2006/wordml" xmlns:wps="http://schemas.microsoft.com/office/word/2010/wordprocessingShape" mc:Ignorable="w14 w15 w16se w16cid w16 w16cex w16sdtdh w16sdtfl w16du wp14">
   <w:abstractNum w:abstractNumId="0" w15:restartNumberingAfterBreak="0">
     <w:nsid w:val="0145720D"/>
     <w:multiLevelType w:val="singleLevel"/>
@@ -1729,7 +1724,7 @@
       </w:pPr>
     </w:lvl>
   </w:abstractNum>
-  <w:num w:numId="1">
+  <w:num w:numId="1" w16cid:durableId="1144617304">
     <w:abstractNumId w:val="2"/>
     <w:lvlOverride w:ilvl="0">
       <w:startOverride w:val="1"/>
@@ -1759,7 +1754,7 @@
       <w:startOverride w:val="1"/>
     </w:lvlOverride>
   </w:num>
-  <w:num w:numId="2">
+  <w:num w:numId="2" w16cid:durableId="324629815">
     <w:abstractNumId w:val="1"/>
     <w:lvlOverride w:ilvl="0">
       <w:startOverride w:val="3"/>
@@ -1789,20 +1784,20 @@
       <w:startOverride w:val="1"/>
     </w:lvlOverride>
   </w:num>
-  <w:num w:numId="3">
+  <w:num w:numId="3" w16cid:durableId="119955865">
     <w:abstractNumId w:val="0"/>
   </w:num>
-  <w:num w:numId="4">
+  <w:num w:numId="4" w16cid:durableId="320622015">
     <w:abstractNumId w:val="1"/>
   </w:num>
-  <w:num w:numId="5">
+  <w:num w:numId="5" w16cid:durableId="1379092021">
     <w:abstractNumId w:val="3"/>
   </w:num>
 </w:numbering>
 </file>
 
 <file path=word/styles.xml><?xml version="1.0" encoding="utf-8"?>
-<w:styles xmlns:mc="http://schemas.openxmlformats.org/markup-compatibility/2006" xmlns:r="http://schemas.openxmlformats.org/officeDocument/2006/relationships" xmlns:w="http://schemas.openxmlformats.org/wordprocessingml/2006/main" xmlns:w14="http://schemas.microsoft.com/office/word/2010/wordml" xmlns:w15="http://schemas.microsoft.com/office/word/2012/wordml" mc:Ignorable="w14 w15">
+<w:styles xmlns:mc="http://schemas.openxmlformats.org/markup-compatibility/2006" xmlns:r="http://schemas.openxmlformats.org/officeDocument/2006/relationships" xmlns:w="http://schemas.openxmlformats.org/wordprocessingml/2006/main" xmlns:w14="http://schemas.microsoft.com/office/word/2010/wordml" xmlns:w15="http://schemas.microsoft.com/office/word/2012/wordml" xmlns:w16cex="http://schemas.microsoft.com/office/word/2018/wordml/cex" xmlns:w16cid="http://schemas.microsoft.com/office/word/2016/wordml/cid" xmlns:w16="http://schemas.microsoft.com/office/word/2018/wordml" xmlns:w16du="http://schemas.microsoft.com/office/word/2023/wordml/word16du" xmlns:w16sdtdh="http://schemas.microsoft.com/office/word/2020/wordml/sdtdatahash" xmlns:w16sdtfl="http://schemas.microsoft.com/office/word/2024/wordml/sdtformatlock" xmlns:w16se="http://schemas.microsoft.com/office/word/2015/wordml/symex" mc:Ignorable="w14 w15 w16se w16cid w16 w16cex w16sdtdh w16sdtfl w16du">
   <w:docDefaults>
     <w:rPrDefault>
       <w:rPr>
@@ -1818,7 +1813,7 @@
       </w:pPr>
     </w:pPrDefault>
   </w:docDefaults>
-  <w:latentStyles w:defLockedState="0" w:defUIPriority="99" w:defSemiHidden="0" w:defUnhideWhenUsed="0" w:defQFormat="0" w:count="371">
+  <w:latentStyles w:defLockedState="0" w:defUIPriority="99" w:defSemiHidden="0" w:defUnhideWhenUsed="0" w:defQFormat="0" w:count="376">
     <w:lsdException w:name="Normal" w:uiPriority="0" w:qFormat="1"/>
     <w:lsdException w:name="heading 1" w:uiPriority="9" w:qFormat="1"/>
     <w:lsdException w:name="heading 2" w:semiHidden="1" w:uiPriority="0" w:unhideWhenUsed="1" w:qFormat="1"/>
@@ -2190,6 +2185,11 @@
     <w:lsdException w:name="List Table 5 Dark Accent 6" w:uiPriority="50"/>
     <w:lsdException w:name="List Table 6 Colorful Accent 6" w:uiPriority="51"/>
     <w:lsdException w:name="List Table 7 Colorful Accent 6" w:uiPriority="52"/>
+    <w:lsdException w:name="Mention" w:semiHidden="1" w:unhideWhenUsed="1"/>
+    <w:lsdException w:name="Smart Hyperlink" w:semiHidden="1" w:unhideWhenUsed="1"/>
+    <w:lsdException w:name="Hashtag" w:semiHidden="1" w:unhideWhenUsed="1"/>
+    <w:lsdException w:name="Unresolved Mention" w:semiHidden="1" w:unhideWhenUsed="1"/>
+    <w:lsdException w:name="Smart Link" w:semiHidden="1" w:unhideWhenUsed="1"/>
   </w:latentStyles>
   <w:style w:type="paragraph" w:default="1" w:styleId="Normal">
     <w:name w:val="Normal"/>

</xml_diff>

<commit_message>
Corrige erros do Caso de Uso 01.
</commit_message>
<xml_diff>
--- a/Requisitos/Documentos de Casos de Uso/CSU01 - ManterSolicitacaoEntrega.docx
+++ b/Requisitos/Documentos de Casos de Uso/CSU01 - ManterSolicitacaoEntrega.docx
@@ -1,6 +1,6 @@
 
 <file path=word/document.xml><?xml version="1.0" encoding="utf-8"?>
-<w:document xmlns:wpc="http://schemas.microsoft.com/office/word/2010/wordprocessingCanvas" xmlns:cx="http://schemas.microsoft.com/office/drawing/2014/chartex" xmlns:cx1="http://schemas.microsoft.com/office/drawing/2015/9/8/chartex" xmlns:cx2="http://schemas.microsoft.com/office/drawing/2015/10/21/chartex" xmlns:cx3="http://schemas.microsoft.com/office/drawing/2016/5/9/chartex" xmlns:cx4="http://schemas.microsoft.com/office/drawing/2016/5/10/chartex" xmlns:cx5="http://schemas.microsoft.com/office/drawing/2016/5/11/chartex" xmlns:cx6="http://schemas.microsoft.com/office/drawing/2016/5/12/chartex" xmlns:cx7="http://schemas.microsoft.com/office/drawing/2016/5/13/chartex" xmlns:cx8="http://schemas.microsoft.com/office/drawing/2016/5/14/chartex" xmlns:mc="http://schemas.openxmlformats.org/markup-compatibility/2006" xmlns:aink="http://schemas.microsoft.com/office/drawing/2016/ink" xmlns:am3d="http://schemas.microsoft.com/office/drawing/2017/model3d" xmlns:o="urn:schemas-microsoft-com:office:office" xmlns:oel="http://schemas.microsoft.com/office/2019/extlst" xmlns:r="http://schemas.openxmlformats.org/officeDocument/2006/relationships" xmlns:m="http://schemas.openxmlformats.org/officeDocument/2006/math" xmlns:v="urn:schemas-microsoft-com:vml" xmlns:wp14="http://schemas.microsoft.com/office/word/2010/wordprocessingDrawing" xmlns:wp="http://schemas.openxmlformats.org/drawingml/2006/wordprocessingDrawing" xmlns:w10="urn:schemas-microsoft-com:office:word" xmlns:w="http://schemas.openxmlformats.org/wordprocessingml/2006/main" xmlns:w14="http://schemas.microsoft.com/office/word/2010/wordml" xmlns:w15="http://schemas.microsoft.com/office/word/2012/wordml" xmlns:w16cex="http://schemas.microsoft.com/office/word/2018/wordml/cex" xmlns:w16cid="http://schemas.microsoft.com/office/word/2016/wordml/cid" xmlns:w16="http://schemas.microsoft.com/office/word/2018/wordml" xmlns:w16du="http://schemas.microsoft.com/office/word/2023/wordml/word16du" xmlns:w16sdtdh="http://schemas.microsoft.com/office/word/2020/wordml/sdtdatahash" xmlns:w16sdtfl="http://schemas.microsoft.com/office/word/2024/wordml/sdtformatlock" xmlns:w16se="http://schemas.microsoft.com/office/word/2015/wordml/symex" xmlns:wpg="http://schemas.microsoft.com/office/word/2010/wordprocessingGroup" xmlns:wpi="http://schemas.microsoft.com/office/word/2010/wordprocessingInk" xmlns:wne="http://schemas.microsoft.com/office/word/2006/wordml" xmlns:wps="http://schemas.microsoft.com/office/word/2010/wordprocessingShape" mc:Ignorable="w14 w15 w16se w16cid w16 w16cex w16sdtdh w16sdtfl w16du wp14">
+<w:document xmlns:wpc="http://schemas.microsoft.com/office/word/2010/wordprocessingCanvas" xmlns:cx="http://schemas.microsoft.com/office/drawing/2014/chartex" xmlns:cx1="http://schemas.microsoft.com/office/drawing/2015/9/8/chartex" xmlns:cx2="http://schemas.microsoft.com/office/drawing/2015/10/21/chartex" xmlns:cx3="http://schemas.microsoft.com/office/drawing/2016/5/9/chartex" xmlns:cx4="http://schemas.microsoft.com/office/drawing/2016/5/10/chartex" xmlns:cx5="http://schemas.microsoft.com/office/drawing/2016/5/11/chartex" xmlns:cx6="http://schemas.microsoft.com/office/drawing/2016/5/12/chartex" xmlns:cx7="http://schemas.microsoft.com/office/drawing/2016/5/13/chartex" xmlns:cx8="http://schemas.microsoft.com/office/drawing/2016/5/14/chartex" xmlns:mc="http://schemas.openxmlformats.org/markup-compatibility/2006" xmlns:aink="http://schemas.microsoft.com/office/drawing/2016/ink" xmlns:am3d="http://schemas.microsoft.com/office/drawing/2017/model3d" xmlns:o="urn:schemas-microsoft-com:office:office" xmlns:oel="http://schemas.microsoft.com/office/2019/extlst" xmlns:r="http://schemas.openxmlformats.org/officeDocument/2006/relationships" xmlns:m="http://schemas.openxmlformats.org/officeDocument/2006/math" xmlns:v="urn:schemas-microsoft-com:vml" xmlns:wp14="http://schemas.microsoft.com/office/word/2010/wordprocessingDrawing" xmlns:wp="http://schemas.openxmlformats.org/drawingml/2006/wordprocessingDrawing" xmlns:w10="urn:schemas-microsoft-com:office:word" xmlns:w="http://schemas.openxmlformats.org/wordprocessingml/2006/main" xmlns:w14="http://schemas.microsoft.com/office/word/2010/wordml" xmlns:w15="http://schemas.microsoft.com/office/word/2012/wordml" xmlns:w16cex="http://schemas.microsoft.com/office/word/2018/wordml/cex" xmlns:w16cid="http://schemas.microsoft.com/office/word/2016/wordml/cid" xmlns:w16="http://schemas.microsoft.com/office/word/2018/wordml" xmlns:w16sdtdh="http://schemas.microsoft.com/office/word/2020/wordml/sdtdatahash" xmlns:w16se="http://schemas.microsoft.com/office/word/2015/wordml/symex" xmlns:wpg="http://schemas.microsoft.com/office/word/2010/wordprocessingGroup" xmlns:wpi="http://schemas.microsoft.com/office/word/2010/wordprocessingInk" xmlns:wne="http://schemas.microsoft.com/office/word/2006/wordml" xmlns:wps="http://schemas.microsoft.com/office/word/2010/wordprocessingShape" mc:Ignorable="w14 w15 w16se w16cid w16 w16cex w16sdtdh wp14">
   <w:body>
     <w:p>
       <w:pPr>
@@ -236,6 +236,7 @@
               <w:rPr>
                 <w:b/>
                 <w:sz w:val="28"/>
+                <w:u w:val="single"/>
               </w:rPr>
             </w:pPr>
             <w:r>
@@ -427,9 +428,14 @@
             <w:pPr>
               <w:rPr>
                 <w:sz w:val="28"/>
-              </w:rPr>
-            </w:pPr>
-            <w:r>
+                <w:szCs w:val="28"/>
+              </w:rPr>
+            </w:pPr>
+            <w:r>
+              <w:rPr>
+                <w:sz w:val="28"/>
+                <w:szCs w:val="28"/>
+              </w:rPr>
               <w:t>Solicitação de entrega criada/alterada/cancelada e persistida.</w:t>
             </w:r>
           </w:p>
@@ -438,7 +444,7 @@
       <w:tr>
         <w:trPr>
           <w:cantSplit/>
-          <w:trHeight w:val="4716"/>
+          <w:trHeight w:val="3464"/>
         </w:trPr>
         <w:tc>
           <w:tcPr>
@@ -479,30 +485,43 @@
               </w:numPr>
               <w:jc w:val="left"/>
               <w:rPr>
-                <w:b/>
-                <w:sz w:val="32"/>
-                <w:szCs w:val="32"/>
-              </w:rPr>
-            </w:pPr>
-            <w:r>
-              <w:rPr>
-                <w:b/>
-                <w:sz w:val="32"/>
-                <w:szCs w:val="32"/>
-              </w:rPr>
-              <w:t>Solicitante seleciona “Nova Solicitação”</w:t>
-            </w:r>
-          </w:p>
-          <w:p>
-            <w:pPr>
-              <w:pStyle w:val="Ttulo2"/>
-              <w:jc w:val="left"/>
-              <w:rPr>
-                <w:b/>
-                <w:sz w:val="32"/>
-                <w:szCs w:val="32"/>
-              </w:rPr>
-            </w:pPr>
+                <w:bCs/>
+                <w:sz w:val="32"/>
+                <w:szCs w:val="32"/>
+              </w:rPr>
+            </w:pPr>
+            <w:r>
+              <w:rPr>
+                <w:bCs/>
+                <w:sz w:val="32"/>
+                <w:szCs w:val="32"/>
+              </w:rPr>
+              <w:t xml:space="preserve">Solicitante </w:t>
+            </w:r>
+            <w:r>
+              <w:rPr>
+                <w:bCs/>
+                <w:sz w:val="32"/>
+                <w:szCs w:val="32"/>
+              </w:rPr>
+              <w:t xml:space="preserve">clica em </w:t>
+            </w:r>
+            <w:r>
+              <w:rPr>
+                <w:bCs/>
+                <w:sz w:val="32"/>
+                <w:szCs w:val="32"/>
+              </w:rPr>
+              <w:t>“Nova Solicitação”</w:t>
+            </w:r>
+            <w:r>
+              <w:rPr>
+                <w:bCs/>
+                <w:sz w:val="32"/>
+                <w:szCs w:val="32"/>
+              </w:rPr>
+              <w:t>.</w:t>
+            </w:r>
           </w:p>
           <w:p>
             <w:pPr>
@@ -513,30 +532,112 @@
               </w:numPr>
               <w:jc w:val="left"/>
               <w:rPr>
-                <w:b/>
-                <w:sz w:val="32"/>
-                <w:szCs w:val="32"/>
-              </w:rPr>
-            </w:pPr>
-            <w:r>
-              <w:rPr>
-                <w:b/>
-                <w:sz w:val="32"/>
-                <w:szCs w:val="32"/>
-              </w:rPr>
-              <w:t>Sistema exibe formulário (origem, destino, descrição do item, dimensões/peso).</w:t>
-            </w:r>
-          </w:p>
-          <w:p>
-            <w:pPr>
-              <w:pStyle w:val="Ttulo2"/>
-              <w:jc w:val="left"/>
-              <w:rPr>
-                <w:b/>
-                <w:sz w:val="32"/>
-                <w:szCs w:val="32"/>
-              </w:rPr>
-            </w:pPr>
+                <w:bCs/>
+                <w:sz w:val="32"/>
+                <w:szCs w:val="32"/>
+              </w:rPr>
+            </w:pPr>
+            <w:r>
+              <w:rPr>
+                <w:bCs/>
+                <w:sz w:val="32"/>
+                <w:szCs w:val="32"/>
+              </w:rPr>
+              <w:t xml:space="preserve">Sistema exibe </w:t>
+            </w:r>
+            <w:r>
+              <w:rPr>
+                <w:bCs/>
+                <w:sz w:val="32"/>
+                <w:szCs w:val="32"/>
+              </w:rPr>
+              <w:t xml:space="preserve">tela </w:t>
+            </w:r>
+            <w:r>
+              <w:rPr>
+                <w:bCs/>
+                <w:sz w:val="32"/>
+                <w:szCs w:val="32"/>
+                <w:u w:val="single"/>
+              </w:rPr>
+              <w:t>de</w:t>
+            </w:r>
+            <w:r>
+              <w:rPr>
+                <w:bCs/>
+                <w:sz w:val="32"/>
+                <w:szCs w:val="32"/>
+              </w:rPr>
+              <w:t xml:space="preserve"> </w:t>
+            </w:r>
+            <w:r>
+              <w:rPr>
+                <w:bCs/>
+                <w:sz w:val="32"/>
+                <w:szCs w:val="32"/>
+              </w:rPr>
+              <w:t>formulário (origem, destino, descrição do item, dimensões/peso)</w:t>
+            </w:r>
+            <w:r>
+              <w:rPr>
+                <w:bCs/>
+                <w:sz w:val="32"/>
+                <w:szCs w:val="32"/>
+              </w:rPr>
+              <w:t>, (</w:t>
+            </w:r>
+            <w:r>
+              <w:rPr>
+                <w:bCs/>
+                <w:color w:val="FF0000"/>
+                <w:sz w:val="32"/>
+                <w:szCs w:val="32"/>
+              </w:rPr>
+              <w:t>Tela</w:t>
+            </w:r>
+            <w:r>
+              <w:rPr>
+                <w:bCs/>
+                <w:color w:val="FF0000"/>
+                <w:sz w:val="32"/>
+                <w:szCs w:val="32"/>
+              </w:rPr>
+              <w:t>_</w:t>
+            </w:r>
+            <w:r>
+              <w:rPr>
+                <w:bCs/>
+                <w:color w:val="FF0000"/>
+                <w:sz w:val="32"/>
+                <w:szCs w:val="32"/>
+              </w:rPr>
+              <w:t>05</w:t>
+            </w:r>
+            <w:r>
+              <w:rPr>
+                <w:bCs/>
+                <w:sz w:val="32"/>
+                <w:szCs w:val="32"/>
+              </w:rPr>
+              <w:t>/</w:t>
+            </w:r>
+            <w:r>
+              <w:rPr>
+                <w:bCs/>
+                <w:color w:val="FF0000"/>
+                <w:sz w:val="32"/>
+                <w:szCs w:val="32"/>
+              </w:rPr>
+              <w:t>Tela_06</w:t>
+            </w:r>
+            <w:r>
+              <w:rPr>
+                <w:bCs/>
+                <w:sz w:val="32"/>
+                <w:szCs w:val="32"/>
+              </w:rPr>
+              <w:t>).</w:t>
+            </w:r>
           </w:p>
           <w:p>
             <w:pPr>
@@ -547,30 +648,69 @@
               </w:numPr>
               <w:jc w:val="left"/>
               <w:rPr>
-                <w:b/>
-                <w:sz w:val="32"/>
-                <w:szCs w:val="32"/>
-              </w:rPr>
-            </w:pPr>
-            <w:r>
-              <w:rPr>
-                <w:b/>
-                <w:sz w:val="32"/>
-                <w:szCs w:val="32"/>
-              </w:rPr>
-              <w:t>Solicitante preenche os dados.</w:t>
-            </w:r>
-          </w:p>
-          <w:p>
-            <w:pPr>
-              <w:pStyle w:val="Ttulo2"/>
-              <w:jc w:val="left"/>
-              <w:rPr>
-                <w:b/>
-                <w:sz w:val="32"/>
-                <w:szCs w:val="32"/>
-              </w:rPr>
-            </w:pPr>
+                <w:bCs/>
+                <w:sz w:val="32"/>
+                <w:szCs w:val="32"/>
+              </w:rPr>
+            </w:pPr>
+            <w:r>
+              <w:rPr>
+                <w:bCs/>
+                <w:sz w:val="32"/>
+                <w:szCs w:val="32"/>
+              </w:rPr>
+              <w:t>Solicitante preenche os dados</w:t>
+            </w:r>
+            <w:r>
+              <w:rPr>
+                <w:bCs/>
+                <w:sz w:val="32"/>
+                <w:szCs w:val="32"/>
+              </w:rPr>
+              <w:t xml:space="preserve"> (</w:t>
+            </w:r>
+            <w:r>
+              <w:rPr>
+                <w:bCs/>
+                <w:color w:val="FF0000"/>
+                <w:sz w:val="32"/>
+                <w:szCs w:val="32"/>
+              </w:rPr>
+              <w:t>Tela_05</w:t>
+            </w:r>
+            <w:r>
+              <w:rPr>
+                <w:bCs/>
+                <w:sz w:val="32"/>
+                <w:szCs w:val="32"/>
+              </w:rPr>
+              <w:t>/</w:t>
+            </w:r>
+            <w:r>
+              <w:rPr>
+                <w:bCs/>
+                <w:color w:val="FF0000"/>
+                <w:sz w:val="32"/>
+                <w:szCs w:val="32"/>
+              </w:rPr>
+              <w:t>Tela_06</w:t>
+            </w:r>
+            <w:r>
+              <w:rPr>
+                <w:bCs/>
+                <w:sz w:val="32"/>
+                <w:szCs w:val="32"/>
+              </w:rPr>
+              <w:t>)</w:t>
+            </w:r>
+            <w:r>
+              <w:rPr>
+                <w:bCs/>
+                <w:sz w:val="32"/>
+                <w:szCs w:val="32"/>
+              </w:rPr>
+              <w:t>.</w:t>
+            </w:r>
           </w:p>
           <w:p>
             <w:pPr>
@@ -581,14 +721,14 @@
               </w:numPr>
               <w:jc w:val="left"/>
               <w:rPr>
-                <w:b/>
-                <w:sz w:val="32"/>
-                <w:szCs w:val="32"/>
-              </w:rPr>
-            </w:pPr>
-            <w:r>
-              <w:rPr>
-                <w:b/>
+                <w:bCs/>
+                <w:sz w:val="32"/>
+                <w:szCs w:val="32"/>
+              </w:rPr>
+            </w:pPr>
+            <w:r>
+              <w:rPr>
+                <w:bCs/>
                 <w:sz w:val="32"/>
                 <w:szCs w:val="32"/>
               </w:rPr>
@@ -596,7 +736,7 @@
             </w:r>
             <w:r>
               <w:rPr>
-                <w:b/>
+                <w:bCs/>
                 <w:sz w:val="32"/>
                 <w:szCs w:val="32"/>
               </w:rPr>
@@ -605,7 +745,7 @@
             <w:proofErr w:type="spellStart"/>
             <w:r>
               <w:rPr>
-                <w:b/>
+                <w:bCs/>
                 <w:sz w:val="32"/>
                 <w:szCs w:val="32"/>
               </w:rPr>
@@ -614,7 +754,7 @@
             <w:proofErr w:type="spellEnd"/>
             <w:r>
               <w:rPr>
-                <w:b/>
+                <w:bCs/>
                 <w:sz w:val="32"/>
                 <w:szCs w:val="32"/>
               </w:rPr>
@@ -622,14 +762,46 @@
             </w:r>
             <w:r>
               <w:rPr>
-                <w:b/>
-                <w:sz w:val="32"/>
-                <w:szCs w:val="32"/>
-              </w:rPr>
-              <w:t xml:space="preserve"> e exibe o valor estimado.</w:t>
-            </w:r>
-          </w:p>
-          <w:p/>
+                <w:bCs/>
+                <w:sz w:val="32"/>
+                <w:szCs w:val="32"/>
+              </w:rPr>
+              <w:t xml:space="preserve"> e exibe o valor estimado</w:t>
+            </w:r>
+            <w:r>
+              <w:rPr>
+                <w:bCs/>
+                <w:sz w:val="32"/>
+                <w:szCs w:val="32"/>
+              </w:rPr>
+              <w:t xml:space="preserve"> (</w:t>
+            </w:r>
+            <w:r>
+              <w:rPr>
+                <w:bCs/>
+                <w:color w:val="FF0000"/>
+                <w:sz w:val="32"/>
+                <w:szCs w:val="32"/>
+              </w:rPr>
+              <w:t>Tela_07</w:t>
+            </w:r>
+            <w:r>
+              <w:rPr>
+                <w:bCs/>
+                <w:sz w:val="32"/>
+                <w:szCs w:val="32"/>
+              </w:rPr>
+              <w:t>)</w:t>
+            </w:r>
+            <w:r>
+              <w:rPr>
+                <w:bCs/>
+                <w:sz w:val="32"/>
+                <w:szCs w:val="32"/>
+              </w:rPr>
+              <w:t>.</w:t>
+            </w:r>
+          </w:p>
           <w:p>
             <w:pPr>
               <w:pStyle w:val="Ttulo2"/>
@@ -639,29 +811,53 @@
               </w:numPr>
               <w:jc w:val="left"/>
               <w:rPr>
-                <w:b/>
-                <w:sz w:val="32"/>
-                <w:szCs w:val="32"/>
-              </w:rPr>
-            </w:pPr>
-            <w:r>
-              <w:rPr>
-                <w:b/>
-                <w:sz w:val="32"/>
-                <w:szCs w:val="32"/>
-              </w:rPr>
-              <w:t xml:space="preserve"> </w:t>
-            </w:r>
-            <w:r>
-              <w:rPr>
-                <w:b/>
-                <w:sz w:val="32"/>
-                <w:szCs w:val="32"/>
-              </w:rPr>
-              <w:t>Solicitante confirma a solicitação.</w:t>
-            </w:r>
-          </w:p>
-          <w:p/>
+                <w:bCs/>
+                <w:sz w:val="32"/>
+                <w:szCs w:val="32"/>
+              </w:rPr>
+            </w:pPr>
+            <w:r>
+              <w:rPr>
+                <w:bCs/>
+                <w:sz w:val="32"/>
+                <w:szCs w:val="32"/>
+              </w:rPr>
+              <w:t xml:space="preserve"> Solicitante confirma a solicitação</w:t>
+            </w:r>
+            <w:r>
+              <w:rPr>
+                <w:bCs/>
+                <w:sz w:val="32"/>
+                <w:szCs w:val="32"/>
+              </w:rPr>
+              <w:t xml:space="preserve"> (</w:t>
+            </w:r>
+            <w:r>
+              <w:rPr>
+                <w:bCs/>
+                <w:color w:val="FF0000"/>
+                <w:sz w:val="32"/>
+                <w:szCs w:val="32"/>
+              </w:rPr>
+              <w:t>Tela_07</w:t>
+            </w:r>
+            <w:r>
+              <w:rPr>
+                <w:bCs/>
+                <w:sz w:val="32"/>
+                <w:szCs w:val="32"/>
+              </w:rPr>
+              <w:t>)</w:t>
+            </w:r>
+            <w:r>
+              <w:rPr>
+                <w:bCs/>
+                <w:sz w:val="32"/>
+                <w:szCs w:val="32"/>
+              </w:rPr>
+              <w:t>.</w:t>
+            </w:r>
+          </w:p>
           <w:p>
             <w:pPr>
               <w:pStyle w:val="Ttulo2"/>
@@ -671,21 +867,53 @@
               </w:numPr>
               <w:jc w:val="left"/>
               <w:rPr>
-                <w:b/>
-                <w:sz w:val="32"/>
-                <w:szCs w:val="32"/>
-              </w:rPr>
-            </w:pPr>
-            <w:r>
-              <w:rPr>
-                <w:b/>
-                <w:sz w:val="32"/>
-                <w:szCs w:val="32"/>
-              </w:rPr>
-              <w:t>Sistema salva a solicitação com status “Aguardando Entregador”.</w:t>
-            </w:r>
-          </w:p>
-          <w:p/>
+                <w:bCs/>
+                <w:sz w:val="32"/>
+                <w:szCs w:val="32"/>
+              </w:rPr>
+            </w:pPr>
+            <w:r>
+              <w:rPr>
+                <w:bCs/>
+                <w:sz w:val="32"/>
+                <w:szCs w:val="32"/>
+              </w:rPr>
+              <w:t>Sistema salva a solicitação com status “Aguardando Entregador”</w:t>
+            </w:r>
+            <w:r>
+              <w:rPr>
+                <w:bCs/>
+                <w:sz w:val="32"/>
+                <w:szCs w:val="32"/>
+              </w:rPr>
+              <w:t xml:space="preserve"> (</w:t>
+            </w:r>
+            <w:r>
+              <w:rPr>
+                <w:bCs/>
+                <w:color w:val="FF0000"/>
+                <w:sz w:val="32"/>
+                <w:szCs w:val="32"/>
+              </w:rPr>
+              <w:t>Tela_08</w:t>
+            </w:r>
+            <w:r>
+              <w:rPr>
+                <w:bCs/>
+                <w:sz w:val="32"/>
+                <w:szCs w:val="32"/>
+              </w:rPr>
+              <w:t>)</w:t>
+            </w:r>
+            <w:r>
+              <w:rPr>
+                <w:bCs/>
+                <w:sz w:val="32"/>
+                <w:szCs w:val="32"/>
+              </w:rPr>
+              <w:t>.</w:t>
+            </w:r>
+          </w:p>
           <w:p>
             <w:pPr>
               <w:pStyle w:val="Ttulo2"/>
@@ -695,18 +923,68 @@
               </w:numPr>
               <w:jc w:val="left"/>
               <w:rPr>
-                <w:b/>
-                <w:sz w:val="32"/>
-                <w:szCs w:val="32"/>
-              </w:rPr>
-            </w:pPr>
-            <w:r>
-              <w:rPr>
-                <w:b/>
-                <w:sz w:val="32"/>
-                <w:szCs w:val="32"/>
-              </w:rPr>
-              <w:t>Sistema exibe confirmação.</w:t>
+                <w:bCs/>
+                <w:sz w:val="32"/>
+                <w:szCs w:val="32"/>
+              </w:rPr>
+            </w:pPr>
+            <w:r>
+              <w:rPr>
+                <w:bCs/>
+                <w:sz w:val="32"/>
+                <w:szCs w:val="32"/>
+              </w:rPr>
+              <w:t>Sistema exibe confirmação</w:t>
+            </w:r>
+            <w:r>
+              <w:rPr>
+                <w:bCs/>
+                <w:sz w:val="32"/>
+                <w:szCs w:val="32"/>
+              </w:rPr>
+              <w:t xml:space="preserve"> </w:t>
+            </w:r>
+            <w:r>
+              <w:rPr>
+                <w:bCs/>
+                <w:sz w:val="32"/>
+                <w:szCs w:val="32"/>
+              </w:rPr>
+              <w:t>(</w:t>
+            </w:r>
+            <w:r>
+              <w:rPr>
+                <w:bCs/>
+                <w:color w:val="FF0000"/>
+                <w:sz w:val="32"/>
+                <w:szCs w:val="32"/>
+              </w:rPr>
+              <w:t>Tela_0</w:t>
+            </w:r>
+            <w:r>
+              <w:rPr>
+                <w:bCs/>
+                <w:color w:val="FF0000"/>
+                <w:sz w:val="32"/>
+                <w:szCs w:val="32"/>
+              </w:rPr>
+              <w:t>9</w:t>
+            </w:r>
+            <w:r>
+              <w:rPr>
+                <w:bCs/>
+                <w:sz w:val="32"/>
+                <w:szCs w:val="32"/>
+              </w:rPr>
+              <w:t>)</w:t>
+            </w:r>
+            <w:r>
+              <w:rPr>
+                <w:bCs/>
+                <w:sz w:val="32"/>
+                <w:szCs w:val="32"/>
+              </w:rPr>
+              <w:t>.</w:t>
             </w:r>
           </w:p>
           <w:p/>
@@ -762,6 +1040,14 @@
             </w:tcBorders>
           </w:tcPr>
           <w:p>
+            <w:pPr>
+              <w:rPr>
+                <w:b/>
+                <w:bCs/>
+                <w:sz w:val="28"/>
+                <w:szCs w:val="28"/>
+              </w:rPr>
+            </w:pPr>
             <w:r>
               <w:rPr>
                 <w:rFonts w:hAnsi="Symbol"/>
@@ -769,116 +1055,119 @@
               <w:t></w:t>
             </w:r>
             <w:r>
-              <w:t xml:space="preserve">  </w:t>
+              <w:t xml:space="preserve"> </w:t>
             </w:r>
             <w:r>
               <w:rPr>
                 <w:rStyle w:val="Forte"/>
-              </w:rPr>
-              <w:t xml:space="preserve">A1 — </w:t>
+                <w:sz w:val="28"/>
+                <w:szCs w:val="28"/>
+              </w:rPr>
+              <w:t>Linha 1:</w:t>
             </w:r>
             <w:r>
               <w:rPr>
                 <w:rStyle w:val="Forte"/>
+              </w:rPr>
+              <w:t xml:space="preserve"> </w:t>
+            </w:r>
+            <w:r>
+              <w:rPr>
+                <w:rStyle w:val="Forte"/>
+                <w:b w:val="0"/>
+                <w:bCs w:val="0"/>
                 <w:sz w:val="28"/>
                 <w:szCs w:val="28"/>
               </w:rPr>
-              <w:t>Alterar:</w:t>
-            </w:r>
-            <w:r>
-              <w:rPr>
+              <w:t>Solicitante clica em ‘Editar’ e não em ‘Nova solicitação</w:t>
+            </w:r>
+            <w:proofErr w:type="gramStart"/>
+            <w:r>
+              <w:rPr>
+                <w:rStyle w:val="Forte"/>
+                <w:b w:val="0"/>
+                <w:bCs w:val="0"/>
                 <w:sz w:val="28"/>
                 <w:szCs w:val="28"/>
               </w:rPr>
-              <w:t xml:space="preserve"> no passo 1, Solicitante escolhe "Editar"</w:t>
-            </w:r>
-            <w:r>
+              <w:t>’ .</w:t>
+            </w:r>
+            <w:proofErr w:type="gramEnd"/>
+            <w:r>
+              <w:rPr>
+                <w:rStyle w:val="Forte"/>
+                <w:b w:val="0"/>
+                <w:bCs w:val="0"/>
+                <w:sz w:val="28"/>
+                <w:szCs w:val="28"/>
+              </w:rPr>
+              <w:t xml:space="preserve"> O sistema carrega endereço salvo e segue a partir da linha 2. Somente permitido se status = “Aguardando Entregador”</w:t>
+            </w:r>
+            <w:r>
+              <w:rPr>
+                <w:rStyle w:val="Forte"/>
+                <w:b w:val="0"/>
+                <w:bCs w:val="0"/>
+                <w:sz w:val="28"/>
+                <w:szCs w:val="28"/>
+              </w:rPr>
+              <w:t>.</w:t>
+            </w:r>
+          </w:p>
+          <w:p>
+            <w:pPr>
+              <w:pStyle w:val="Ttulo2"/>
+              <w:jc w:val="left"/>
+              <w:rPr>
+                <w:b/>
+                <w:bCs/>
+              </w:rPr>
+            </w:pPr>
+            <w:r>
+              <w:rPr>
+                <w:rFonts w:hAnsi="Symbol"/>
+                <w:sz w:val="24"/>
+                <w:szCs w:val="24"/>
+              </w:rPr>
+              <w:t></w:t>
+            </w:r>
+            <w:r>
+              <w:rPr>
+                <w:b/>
+                <w:bCs/>
+              </w:rPr>
               <w:t xml:space="preserve"> </w:t>
             </w:r>
             <w:r>
               <w:rPr>
-                <w:sz w:val="28"/>
-                <w:szCs w:val="28"/>
-              </w:rPr>
-              <w:t>em vez de "Nova"; sistema carrega dados existentes; segue do passo 2. Só permitido se status = "Aguardando Entregador" (ainda não aceita).</w:t>
-            </w:r>
-            <w:r>
-              <w:t xml:space="preserve"> </w:t>
-            </w:r>
-          </w:p>
-          <w:p>
-            <w:pPr>
-              <w:pStyle w:val="Ttulo2"/>
-              <w:rPr>
-                <w:b/>
-              </w:rPr>
-            </w:pPr>
-            <w:r>
-              <w:rPr>
-                <w:rFonts w:hAnsi="Symbol"/>
-              </w:rPr>
-              <w:t></w:t>
-            </w:r>
-            <w:r>
-              <w:t xml:space="preserve">  </w:t>
-            </w:r>
-            <w:r>
-              <w:rPr>
                 <w:rStyle w:val="Forte"/>
               </w:rPr>
-              <w:t>A2 — Cancelar (</w:t>
-            </w:r>
-            <w:r>
-              <w:rPr>
-                <w:rStyle w:val="CdigoHTML"/>
-                <w:b/>
-                <w:bCs/>
-              </w:rPr>
-              <w:t>«</w:t>
+              <w:t>Linha 6</w:t>
+            </w:r>
+            <w:r>
+              <w:rPr>
+                <w:rStyle w:val="Forte"/>
+                <w:b w:val="0"/>
+                <w:bCs w:val="0"/>
+              </w:rPr>
+              <w:t xml:space="preserve">: Solicitante cancela antes da entrega ser concluída. Se já houve pagamento, acione </w:t>
             </w:r>
             <w:proofErr w:type="spellStart"/>
             <w:r>
               <w:rPr>
-                <w:rStyle w:val="CdigoHTML"/>
-                <w:b/>
-                <w:bCs/>
-              </w:rPr>
-              <w:t>extend</w:t>
+                <w:rStyle w:val="Forte"/>
+                <w:b w:val="0"/>
+                <w:bCs w:val="0"/>
+              </w:rPr>
+              <w:t>EstornarPagamento</w:t>
             </w:r>
             <w:proofErr w:type="spellEnd"/>
             <w:r>
               <w:rPr>
-                <w:rStyle w:val="CdigoHTML"/>
-                <w:b/>
-                <w:bCs/>
-              </w:rPr>
-              <w:t xml:space="preserve">» </w:t>
-            </w:r>
-            <w:proofErr w:type="spellStart"/>
-            <w:r>
-              <w:rPr>
-                <w:rStyle w:val="CdigoHTML"/>
-                <w:b/>
-                <w:bCs/>
-              </w:rPr>
-              <w:t>CancelarSolicitacao</w:t>
-            </w:r>
-            <w:proofErr w:type="spellEnd"/>
-            <w:r>
-              <w:rPr>
                 <w:rStyle w:val="Forte"/>
-              </w:rPr>
-              <w:t>):</w:t>
-            </w:r>
-            <w:r>
-              <w:t xml:space="preserve"> disparado a qualquer momento antes da entrega ser concluída; se já houve pagamento, aciona </w:t>
-            </w:r>
-            <w:proofErr w:type="spellStart"/>
-            <w:r>
-              <w:t>EstornarPagamento</w:t>
-            </w:r>
-            <w:proofErr w:type="spellEnd"/>
-            <w:r>
+                <w:b w:val="0"/>
+                <w:bCs w:val="0"/>
+              </w:rPr>
               <w:t>.</w:t>
             </w:r>
           </w:p>
@@ -947,7 +1236,7 @@
               <w:t></w:t>
             </w:r>
             <w:r>
-              <w:t xml:space="preserve">  </w:t>
+              <w:t xml:space="preserve"> </w:t>
             </w:r>
             <w:r>
               <w:rPr>
@@ -955,49 +1244,69 @@
                 <w:sz w:val="28"/>
                 <w:szCs w:val="28"/>
               </w:rPr>
-              <w:t>E1:</w:t>
-            </w:r>
-            <w:r>
-              <w:rPr>
+              <w:t>Linha 4</w:t>
+            </w:r>
+            <w:r>
+              <w:rPr>
+                <w:rStyle w:val="Forte"/>
                 <w:sz w:val="28"/>
                 <w:szCs w:val="28"/>
               </w:rPr>
-              <w:t xml:space="preserve"> endereço inválido → sistema exibe erro, retorna ao passo 3 </w:t>
+              <w:t>:</w:t>
+            </w:r>
+            <w:r>
+              <w:rPr>
+                <w:sz w:val="28"/>
+                <w:szCs w:val="28"/>
+              </w:rPr>
+              <w:t xml:space="preserve"> endereço inválido → sistema exibe erro, retorna ao passo 3</w:t>
+            </w:r>
+            <w:r>
+              <w:rPr>
+                <w:sz w:val="28"/>
+                <w:szCs w:val="28"/>
+              </w:rPr>
+              <w:t>.</w:t>
             </w:r>
           </w:p>
           <w:p>
             <w:r>
               <w:rPr>
                 <w:rFonts w:hAnsi="Symbol"/>
+              </w:rPr>
+              <w:t></w:t>
+            </w:r>
+            <w:r>
+              <w:rPr>
+                <w:rFonts w:hAnsi="Symbol"/>
+              </w:rPr>
+              <w:t xml:space="preserve"> </w:t>
+            </w:r>
+            <w:r>
+              <w:rPr>
+                <w:rStyle w:val="Forte"/>
                 <w:sz w:val="28"/>
                 <w:szCs w:val="28"/>
               </w:rPr>
-              <w:t></w:t>
-            </w:r>
-            <w:r>
-              <w:rPr>
+              <w:t>Linha 4</w:t>
+            </w:r>
+            <w:r>
+              <w:rPr>
+                <w:rStyle w:val="Forte"/>
                 <w:sz w:val="28"/>
                 <w:szCs w:val="28"/>
               </w:rPr>
-              <w:t xml:space="preserve">  </w:t>
-            </w:r>
-            <w:r>
-              <w:rPr>
-                <w:rStyle w:val="Forte"/>
+              <w:t>:</w:t>
+            </w:r>
+            <w:r>
+              <w:rPr>
                 <w:sz w:val="28"/>
                 <w:szCs w:val="28"/>
               </w:rPr>
-              <w:t>E2:</w:t>
-            </w:r>
-            <w:r>
-              <w:rPr>
-                <w:sz w:val="28"/>
-                <w:szCs w:val="28"/>
-              </w:rPr>
               <w:t xml:space="preserve"> falha ao calcular frete (serviço externo indisponível) → sistema informa erro, permite tentar novamente ou salvar como rascunho</w:t>
             </w:r>
             <w:r>
-              <w:t xml:space="preserve"> </w:t>
+              <w:t>.</w:t>
             </w:r>
           </w:p>
         </w:tc>
@@ -1214,7 +1523,6 @@
               <w:jc w:val="center"/>
             </w:pPr>
             <w:r>
-              <w:lastRenderedPageBreak/>
               <w:t>19/12/2014</w:t>
             </w:r>
           </w:p>
@@ -1412,7 +1720,7 @@
 </file>
 
 <file path=word/numbering.xml><?xml version="1.0" encoding="utf-8"?>
-<w:numbering xmlns:wpc="http://schemas.microsoft.com/office/word/2010/wordprocessingCanvas" xmlns:cx="http://schemas.microsoft.com/office/drawing/2014/chartex" xmlns:cx1="http://schemas.microsoft.com/office/drawing/2015/9/8/chartex" xmlns:cx2="http://schemas.microsoft.com/office/drawing/2015/10/21/chartex" xmlns:cx3="http://schemas.microsoft.com/office/drawing/2016/5/9/chartex" xmlns:cx4="http://schemas.microsoft.com/office/drawing/2016/5/10/chartex" xmlns:cx5="http://schemas.microsoft.com/office/drawing/2016/5/11/chartex" xmlns:cx6="http://schemas.microsoft.com/office/drawing/2016/5/12/chartex" xmlns:cx7="http://schemas.microsoft.com/office/drawing/2016/5/13/chartex" xmlns:cx8="http://schemas.microsoft.com/office/drawing/2016/5/14/chartex" xmlns:mc="http://schemas.openxmlformats.org/markup-compatibility/2006" xmlns:aink="http://schemas.microsoft.com/office/drawing/2016/ink" xmlns:am3d="http://schemas.microsoft.com/office/drawing/2017/model3d" xmlns:o="urn:schemas-microsoft-com:office:office" xmlns:oel="http://schemas.microsoft.com/office/2019/extlst" xmlns:r="http://schemas.openxmlformats.org/officeDocument/2006/relationships" xmlns:m="http://schemas.openxmlformats.org/officeDocument/2006/math" xmlns:v="urn:schemas-microsoft-com:vml" xmlns:wp14="http://schemas.microsoft.com/office/word/2010/wordprocessingDrawing" xmlns:wp="http://schemas.openxmlformats.org/drawingml/2006/wordprocessingDrawing" xmlns:w10="urn:schemas-microsoft-com:office:word" xmlns:w="http://schemas.openxmlformats.org/wordprocessingml/2006/main" xmlns:w14="http://schemas.microsoft.com/office/word/2010/wordml" xmlns:w15="http://schemas.microsoft.com/office/word/2012/wordml" xmlns:w16cex="http://schemas.microsoft.com/office/word/2018/wordml/cex" xmlns:w16cid="http://schemas.microsoft.com/office/word/2016/wordml/cid" xmlns:w16="http://schemas.microsoft.com/office/word/2018/wordml" xmlns:w16du="http://schemas.microsoft.com/office/word/2023/wordml/word16du" xmlns:w16sdtdh="http://schemas.microsoft.com/office/word/2020/wordml/sdtdatahash" xmlns:w16sdtfl="http://schemas.microsoft.com/office/word/2024/wordml/sdtformatlock" xmlns:w16se="http://schemas.microsoft.com/office/word/2015/wordml/symex" xmlns:wpg="http://schemas.microsoft.com/office/word/2010/wordprocessingGroup" xmlns:wpi="http://schemas.microsoft.com/office/word/2010/wordprocessingInk" xmlns:wne="http://schemas.microsoft.com/office/word/2006/wordml" xmlns:wps="http://schemas.microsoft.com/office/word/2010/wordprocessingShape" mc:Ignorable="w14 w15 w16se w16cid w16 w16cex w16sdtdh w16sdtfl w16du wp14">
+<w:numbering xmlns:wpc="http://schemas.microsoft.com/office/word/2010/wordprocessingCanvas" xmlns:cx="http://schemas.microsoft.com/office/drawing/2014/chartex" xmlns:cx1="http://schemas.microsoft.com/office/drawing/2015/9/8/chartex" xmlns:cx2="http://schemas.microsoft.com/office/drawing/2015/10/21/chartex" xmlns:cx3="http://schemas.microsoft.com/office/drawing/2016/5/9/chartex" xmlns:cx4="http://schemas.microsoft.com/office/drawing/2016/5/10/chartex" xmlns:cx5="http://schemas.microsoft.com/office/drawing/2016/5/11/chartex" xmlns:cx6="http://schemas.microsoft.com/office/drawing/2016/5/12/chartex" xmlns:cx7="http://schemas.microsoft.com/office/drawing/2016/5/13/chartex" xmlns:cx8="http://schemas.microsoft.com/office/drawing/2016/5/14/chartex" xmlns:mc="http://schemas.openxmlformats.org/markup-compatibility/2006" xmlns:aink="http://schemas.microsoft.com/office/drawing/2016/ink" xmlns:am3d="http://schemas.microsoft.com/office/drawing/2017/model3d" xmlns:o="urn:schemas-microsoft-com:office:office" xmlns:oel="http://schemas.microsoft.com/office/2019/extlst" xmlns:r="http://schemas.openxmlformats.org/officeDocument/2006/relationships" xmlns:m="http://schemas.openxmlformats.org/officeDocument/2006/math" xmlns:v="urn:schemas-microsoft-com:vml" xmlns:wp14="http://schemas.microsoft.com/office/word/2010/wordprocessingDrawing" xmlns:wp="http://schemas.openxmlformats.org/drawingml/2006/wordprocessingDrawing" xmlns:w10="urn:schemas-microsoft-com:office:word" xmlns:w="http://schemas.openxmlformats.org/wordprocessingml/2006/main" xmlns:w14="http://schemas.microsoft.com/office/word/2010/wordml" xmlns:w15="http://schemas.microsoft.com/office/word/2012/wordml" xmlns:w16cex="http://schemas.microsoft.com/office/word/2018/wordml/cex" xmlns:w16cid="http://schemas.microsoft.com/office/word/2016/wordml/cid" xmlns:w16="http://schemas.microsoft.com/office/word/2018/wordml" xmlns:w16sdtdh="http://schemas.microsoft.com/office/word/2020/wordml/sdtdatahash" xmlns:w16se="http://schemas.microsoft.com/office/word/2015/wordml/symex" xmlns:wpg="http://schemas.microsoft.com/office/word/2010/wordprocessingGroup" xmlns:wpi="http://schemas.microsoft.com/office/word/2010/wordprocessingInk" xmlns:wne="http://schemas.microsoft.com/office/word/2006/wordml" xmlns:wps="http://schemas.microsoft.com/office/word/2010/wordprocessingShape" mc:Ignorable="w14 w15 w16se w16cid w16 w16cex w16sdtdh wp14">
   <w:abstractNum w:abstractNumId="0" w15:restartNumberingAfterBreak="0">
     <w:nsid w:val="0145720D"/>
     <w:multiLevelType w:val="singleLevel"/>
@@ -1724,7 +2032,7 @@
       </w:pPr>
     </w:lvl>
   </w:abstractNum>
-  <w:num w:numId="1" w16cid:durableId="1144617304">
+  <w:num w:numId="1" w16cid:durableId="285627451">
     <w:abstractNumId w:val="2"/>
     <w:lvlOverride w:ilvl="0">
       <w:startOverride w:val="1"/>
@@ -1754,7 +2062,7 @@
       <w:startOverride w:val="1"/>
     </w:lvlOverride>
   </w:num>
-  <w:num w:numId="2" w16cid:durableId="324629815">
+  <w:num w:numId="2" w16cid:durableId="233273896">
     <w:abstractNumId w:val="1"/>
     <w:lvlOverride w:ilvl="0">
       <w:startOverride w:val="3"/>
@@ -1784,20 +2092,20 @@
       <w:startOverride w:val="1"/>
     </w:lvlOverride>
   </w:num>
-  <w:num w:numId="3" w16cid:durableId="119955865">
+  <w:num w:numId="3" w16cid:durableId="1827740991">
     <w:abstractNumId w:val="0"/>
   </w:num>
-  <w:num w:numId="4" w16cid:durableId="320622015">
+  <w:num w:numId="4" w16cid:durableId="98641828">
     <w:abstractNumId w:val="1"/>
   </w:num>
-  <w:num w:numId="5" w16cid:durableId="1379092021">
+  <w:num w:numId="5" w16cid:durableId="1988433466">
     <w:abstractNumId w:val="3"/>
   </w:num>
 </w:numbering>
 </file>
 
 <file path=word/styles.xml><?xml version="1.0" encoding="utf-8"?>
-<w:styles xmlns:mc="http://schemas.openxmlformats.org/markup-compatibility/2006" xmlns:r="http://schemas.openxmlformats.org/officeDocument/2006/relationships" xmlns:w="http://schemas.openxmlformats.org/wordprocessingml/2006/main" xmlns:w14="http://schemas.microsoft.com/office/word/2010/wordml" xmlns:w15="http://schemas.microsoft.com/office/word/2012/wordml" xmlns:w16cex="http://schemas.microsoft.com/office/word/2018/wordml/cex" xmlns:w16cid="http://schemas.microsoft.com/office/word/2016/wordml/cid" xmlns:w16="http://schemas.microsoft.com/office/word/2018/wordml" xmlns:w16du="http://schemas.microsoft.com/office/word/2023/wordml/word16du" xmlns:w16sdtdh="http://schemas.microsoft.com/office/word/2020/wordml/sdtdatahash" xmlns:w16sdtfl="http://schemas.microsoft.com/office/word/2024/wordml/sdtformatlock" xmlns:w16se="http://schemas.microsoft.com/office/word/2015/wordml/symex" mc:Ignorable="w14 w15 w16se w16cid w16 w16cex w16sdtdh w16sdtfl w16du">
+<w:styles xmlns:mc="http://schemas.openxmlformats.org/markup-compatibility/2006" xmlns:r="http://schemas.openxmlformats.org/officeDocument/2006/relationships" xmlns:w="http://schemas.openxmlformats.org/wordprocessingml/2006/main" xmlns:w14="http://schemas.microsoft.com/office/word/2010/wordml" xmlns:w15="http://schemas.microsoft.com/office/word/2012/wordml" xmlns:w16cex="http://schemas.microsoft.com/office/word/2018/wordml/cex" xmlns:w16cid="http://schemas.microsoft.com/office/word/2016/wordml/cid" xmlns:w16="http://schemas.microsoft.com/office/word/2018/wordml" xmlns:w16sdtdh="http://schemas.microsoft.com/office/word/2020/wordml/sdtdatahash" xmlns:w16se="http://schemas.microsoft.com/office/word/2015/wordml/symex" mc:Ignorable="w14 w15 w16se w16cid w16 w16cex w16sdtdh">
   <w:docDefaults>
     <w:rPrDefault>
       <w:rPr>

</xml_diff>

<commit_message>
Redefinição dos Casos de Uso para a versão anterior.
Título da vesão anterior: Diagramas atualizados BPMN, StarUML e casos de uso.
</commit_message>
<xml_diff>
--- a/Requisitos/Documentos de Casos de Uso/CSU01 - ManterSolicitacaoEntrega.docx
+++ b/Requisitos/Documentos de Casos de Uso/CSU01 - ManterSolicitacaoEntrega.docx
@@ -1,6 +1,6 @@
 
 <file path=word/document.xml><?xml version="1.0" encoding="utf-8"?>
-<w:document xmlns:wpc="http://schemas.microsoft.com/office/word/2010/wordprocessingCanvas" xmlns:cx="http://schemas.microsoft.com/office/drawing/2014/chartex" xmlns:cx1="http://schemas.microsoft.com/office/drawing/2015/9/8/chartex" xmlns:cx2="http://schemas.microsoft.com/office/drawing/2015/10/21/chartex" xmlns:cx3="http://schemas.microsoft.com/office/drawing/2016/5/9/chartex" xmlns:cx4="http://schemas.microsoft.com/office/drawing/2016/5/10/chartex" xmlns:cx5="http://schemas.microsoft.com/office/drawing/2016/5/11/chartex" xmlns:cx6="http://schemas.microsoft.com/office/drawing/2016/5/12/chartex" xmlns:cx7="http://schemas.microsoft.com/office/drawing/2016/5/13/chartex" xmlns:cx8="http://schemas.microsoft.com/office/drawing/2016/5/14/chartex" xmlns:mc="http://schemas.openxmlformats.org/markup-compatibility/2006" xmlns:aink="http://schemas.microsoft.com/office/drawing/2016/ink" xmlns:am3d="http://schemas.microsoft.com/office/drawing/2017/model3d" xmlns:o="urn:schemas-microsoft-com:office:office" xmlns:oel="http://schemas.microsoft.com/office/2019/extlst" xmlns:r="http://schemas.openxmlformats.org/officeDocument/2006/relationships" xmlns:m="http://schemas.openxmlformats.org/officeDocument/2006/math" xmlns:v="urn:schemas-microsoft-com:vml" xmlns:wp14="http://schemas.microsoft.com/office/word/2010/wordprocessingDrawing" xmlns:wp="http://schemas.openxmlformats.org/drawingml/2006/wordprocessingDrawing" xmlns:w10="urn:schemas-microsoft-com:office:word" xmlns:w="http://schemas.openxmlformats.org/wordprocessingml/2006/main" xmlns:w14="http://schemas.microsoft.com/office/word/2010/wordml" xmlns:w15="http://schemas.microsoft.com/office/word/2012/wordml" xmlns:w16cex="http://schemas.microsoft.com/office/word/2018/wordml/cex" xmlns:w16cid="http://schemas.microsoft.com/office/word/2016/wordml/cid" xmlns:w16="http://schemas.microsoft.com/office/word/2018/wordml" xmlns:w16sdtdh="http://schemas.microsoft.com/office/word/2020/wordml/sdtdatahash" xmlns:w16se="http://schemas.microsoft.com/office/word/2015/wordml/symex" xmlns:wpg="http://schemas.microsoft.com/office/word/2010/wordprocessingGroup" xmlns:wpi="http://schemas.microsoft.com/office/word/2010/wordprocessingInk" xmlns:wne="http://schemas.microsoft.com/office/word/2006/wordml" xmlns:wps="http://schemas.microsoft.com/office/word/2010/wordprocessingShape" mc:Ignorable="w14 w15 w16se w16cid w16 w16cex w16sdtdh wp14">
+<w:document xmlns:wpc="http://schemas.microsoft.com/office/word/2010/wordprocessingCanvas" xmlns:cx="http://schemas.microsoft.com/office/drawing/2014/chartex" xmlns:cx1="http://schemas.microsoft.com/office/drawing/2015/9/8/chartex" xmlns:cx2="http://schemas.microsoft.com/office/drawing/2015/10/21/chartex" xmlns:cx3="http://schemas.microsoft.com/office/drawing/2016/5/9/chartex" xmlns:cx4="http://schemas.microsoft.com/office/drawing/2016/5/10/chartex" xmlns:cx5="http://schemas.microsoft.com/office/drawing/2016/5/11/chartex" xmlns:cx6="http://schemas.microsoft.com/office/drawing/2016/5/12/chartex" xmlns:cx7="http://schemas.microsoft.com/office/drawing/2016/5/13/chartex" xmlns:cx8="http://schemas.microsoft.com/office/drawing/2016/5/14/chartex" xmlns:mc="http://schemas.openxmlformats.org/markup-compatibility/2006" xmlns:aink="http://schemas.microsoft.com/office/drawing/2016/ink" xmlns:am3d="http://schemas.microsoft.com/office/drawing/2017/model3d" xmlns:o="urn:schemas-microsoft-com:office:office" xmlns:oel="http://schemas.microsoft.com/office/2019/extlst" xmlns:r="http://schemas.openxmlformats.org/officeDocument/2006/relationships" xmlns:m="http://schemas.openxmlformats.org/officeDocument/2006/math" xmlns:v="urn:schemas-microsoft-com:vml" xmlns:wp14="http://schemas.microsoft.com/office/word/2010/wordprocessingDrawing" xmlns:wp="http://schemas.openxmlformats.org/drawingml/2006/wordprocessingDrawing" xmlns:w10="urn:schemas-microsoft-com:office:word" xmlns:w="http://schemas.openxmlformats.org/wordprocessingml/2006/main" xmlns:w14="http://schemas.microsoft.com/office/word/2010/wordml" xmlns:w15="http://schemas.microsoft.com/office/word/2012/wordml" xmlns:w16cex="http://schemas.microsoft.com/office/word/2018/wordml/cex" xmlns:w16cid="http://schemas.microsoft.com/office/word/2016/wordml/cid" xmlns:w16="http://schemas.microsoft.com/office/word/2018/wordml" xmlns:w16du="http://schemas.microsoft.com/office/word/2023/wordml/word16du" xmlns:w16sdtdh="http://schemas.microsoft.com/office/word/2020/wordml/sdtdatahash" xmlns:w16sdtfl="http://schemas.microsoft.com/office/word/2024/wordml/sdtformatlock" xmlns:w16se="http://schemas.microsoft.com/office/word/2015/wordml/symex" xmlns:wpg="http://schemas.microsoft.com/office/word/2010/wordprocessingGroup" xmlns:wpi="http://schemas.microsoft.com/office/word/2010/wordprocessingInk" xmlns:wne="http://schemas.microsoft.com/office/word/2006/wordml" xmlns:wps="http://schemas.microsoft.com/office/word/2010/wordprocessingShape" mc:Ignorable="w14 w15 w16se w16cid w16 w16cex w16sdtdh w16sdtfl w16du wp14">
   <w:body>
     <w:p>
       <w:pPr>
@@ -236,7 +236,6 @@
               <w:rPr>
                 <w:b/>
                 <w:sz w:val="28"/>
-                <w:u w:val="single"/>
               </w:rPr>
             </w:pPr>
             <w:r>
@@ -428,14 +427,9 @@
             <w:pPr>
               <w:rPr>
                 <w:sz w:val="28"/>
-                <w:szCs w:val="28"/>
-              </w:rPr>
-            </w:pPr>
-            <w:r>
-              <w:rPr>
-                <w:sz w:val="28"/>
-                <w:szCs w:val="28"/>
-              </w:rPr>
+              </w:rPr>
+            </w:pPr>
+            <w:r>
               <w:t>Solicitação de entrega criada/alterada/cancelada e persistida.</w:t>
             </w:r>
           </w:p>
@@ -444,7 +438,7 @@
       <w:tr>
         <w:trPr>
           <w:cantSplit/>
-          <w:trHeight w:val="3464"/>
+          <w:trHeight w:val="4716"/>
         </w:trPr>
         <w:tc>
           <w:tcPr>
@@ -485,43 +479,30 @@
               </w:numPr>
               <w:jc w:val="left"/>
               <w:rPr>
-                <w:bCs/>
+                <w:b/>
                 <w:sz w:val="32"/>
                 <w:szCs w:val="32"/>
               </w:rPr>
             </w:pPr>
             <w:r>
               <w:rPr>
-                <w:bCs/>
+                <w:b/>
                 <w:sz w:val="32"/>
                 <w:szCs w:val="32"/>
               </w:rPr>
-              <w:t xml:space="preserve">Solicitante </w:t>
-            </w:r>
-            <w:r>
-              <w:rPr>
-                <w:bCs/>
+              <w:t>Solicitante seleciona “Nova Solicitação”</w:t>
+            </w:r>
+          </w:p>
+          <w:p>
+            <w:pPr>
+              <w:pStyle w:val="Ttulo2"/>
+              <w:jc w:val="left"/>
+              <w:rPr>
+                <w:b/>
                 <w:sz w:val="32"/>
                 <w:szCs w:val="32"/>
               </w:rPr>
-              <w:t xml:space="preserve">clica em </w:t>
-            </w:r>
-            <w:r>
-              <w:rPr>
-                <w:bCs/>
-                <w:sz w:val="32"/>
-                <w:szCs w:val="32"/>
-              </w:rPr>
-              <w:t>“Nova Solicitação”</w:t>
-            </w:r>
-            <w:r>
-              <w:rPr>
-                <w:bCs/>
-                <w:sz w:val="32"/>
-                <w:szCs w:val="32"/>
-              </w:rPr>
-              <w:t>.</w:t>
-            </w:r>
+            </w:pPr>
           </w:p>
           <w:p>
             <w:pPr>
@@ -532,112 +513,30 @@
               </w:numPr>
               <w:jc w:val="left"/>
               <w:rPr>
-                <w:bCs/>
+                <w:b/>
                 <w:sz w:val="32"/>
                 <w:szCs w:val="32"/>
               </w:rPr>
             </w:pPr>
             <w:r>
               <w:rPr>
-                <w:bCs/>
+                <w:b/>
                 <w:sz w:val="32"/>
                 <w:szCs w:val="32"/>
               </w:rPr>
-              <w:t xml:space="preserve">Sistema exibe </w:t>
-            </w:r>
-            <w:r>
-              <w:rPr>
-                <w:bCs/>
+              <w:t>Sistema exibe formulário (origem, destino, descrição do item, dimensões/peso).</w:t>
+            </w:r>
+          </w:p>
+          <w:p>
+            <w:pPr>
+              <w:pStyle w:val="Ttulo2"/>
+              <w:jc w:val="left"/>
+              <w:rPr>
+                <w:b/>
                 <w:sz w:val="32"/>
                 <w:szCs w:val="32"/>
               </w:rPr>
-              <w:t xml:space="preserve">tela </w:t>
-            </w:r>
-            <w:r>
-              <w:rPr>
-                <w:bCs/>
-                <w:sz w:val="32"/>
-                <w:szCs w:val="32"/>
-                <w:u w:val="single"/>
-              </w:rPr>
-              <w:t>de</w:t>
-            </w:r>
-            <w:r>
-              <w:rPr>
-                <w:bCs/>
-                <w:sz w:val="32"/>
-                <w:szCs w:val="32"/>
-              </w:rPr>
-              <w:t xml:space="preserve"> </w:t>
-            </w:r>
-            <w:r>
-              <w:rPr>
-                <w:bCs/>
-                <w:sz w:val="32"/>
-                <w:szCs w:val="32"/>
-              </w:rPr>
-              <w:t>formulário (origem, destino, descrição do item, dimensões/peso)</w:t>
-            </w:r>
-            <w:r>
-              <w:rPr>
-                <w:bCs/>
-                <w:sz w:val="32"/>
-                <w:szCs w:val="32"/>
-              </w:rPr>
-              <w:t>, (</w:t>
-            </w:r>
-            <w:r>
-              <w:rPr>
-                <w:bCs/>
-                <w:color w:val="FF0000"/>
-                <w:sz w:val="32"/>
-                <w:szCs w:val="32"/>
-              </w:rPr>
-              <w:t>Tela</w:t>
-            </w:r>
-            <w:r>
-              <w:rPr>
-                <w:bCs/>
-                <w:color w:val="FF0000"/>
-                <w:sz w:val="32"/>
-                <w:szCs w:val="32"/>
-              </w:rPr>
-              <w:t>_</w:t>
-            </w:r>
-            <w:r>
-              <w:rPr>
-                <w:bCs/>
-                <w:color w:val="FF0000"/>
-                <w:sz w:val="32"/>
-                <w:szCs w:val="32"/>
-              </w:rPr>
-              <w:t>05</w:t>
-            </w:r>
-            <w:r>
-              <w:rPr>
-                <w:bCs/>
-                <w:sz w:val="32"/>
-                <w:szCs w:val="32"/>
-              </w:rPr>
-              <w:t>/</w:t>
-            </w:r>
-            <w:r>
-              <w:rPr>
-                <w:bCs/>
-                <w:color w:val="FF0000"/>
-                <w:sz w:val="32"/>
-                <w:szCs w:val="32"/>
-              </w:rPr>
-              <w:t>Tela_06</w:t>
-            </w:r>
-            <w:r>
-              <w:rPr>
-                <w:bCs/>
-                <w:sz w:val="32"/>
-                <w:szCs w:val="32"/>
-              </w:rPr>
-              <w:t>).</w:t>
-            </w:r>
+            </w:pPr>
           </w:p>
           <w:p>
             <w:pPr>
@@ -648,69 +547,30 @@
               </w:numPr>
               <w:jc w:val="left"/>
               <w:rPr>
-                <w:bCs/>
+                <w:b/>
                 <w:sz w:val="32"/>
                 <w:szCs w:val="32"/>
               </w:rPr>
             </w:pPr>
             <w:r>
               <w:rPr>
-                <w:bCs/>
+                <w:b/>
                 <w:sz w:val="32"/>
                 <w:szCs w:val="32"/>
               </w:rPr>
-              <w:t>Solicitante preenche os dados</w:t>
-            </w:r>
-            <w:r>
-              <w:rPr>
-                <w:bCs/>
+              <w:t>Solicitante preenche os dados.</w:t>
+            </w:r>
+          </w:p>
+          <w:p>
+            <w:pPr>
+              <w:pStyle w:val="Ttulo2"/>
+              <w:jc w:val="left"/>
+              <w:rPr>
+                <w:b/>
                 <w:sz w:val="32"/>
                 <w:szCs w:val="32"/>
               </w:rPr>
-              <w:t xml:space="preserve"> (</w:t>
-            </w:r>
-            <w:r>
-              <w:rPr>
-                <w:bCs/>
-                <w:color w:val="FF0000"/>
-                <w:sz w:val="32"/>
-                <w:szCs w:val="32"/>
-              </w:rPr>
-              <w:t>Tela_05</w:t>
-            </w:r>
-            <w:r>
-              <w:rPr>
-                <w:bCs/>
-                <w:sz w:val="32"/>
-                <w:szCs w:val="32"/>
-              </w:rPr>
-              <w:t>/</w:t>
-            </w:r>
-            <w:r>
-              <w:rPr>
-                <w:bCs/>
-                <w:color w:val="FF0000"/>
-                <w:sz w:val="32"/>
-                <w:szCs w:val="32"/>
-              </w:rPr>
-              <w:t>Tela_06</w:t>
-            </w:r>
-            <w:r>
-              <w:rPr>
-                <w:bCs/>
-                <w:sz w:val="32"/>
-                <w:szCs w:val="32"/>
-              </w:rPr>
-              <w:t>)</w:t>
-            </w:r>
-            <w:r>
-              <w:rPr>
-                <w:bCs/>
-                <w:sz w:val="32"/>
-                <w:szCs w:val="32"/>
-              </w:rPr>
-              <w:t>.</w:t>
-            </w:r>
+            </w:pPr>
           </w:p>
           <w:p>
             <w:pPr>
@@ -721,14 +581,14 @@
               </w:numPr>
               <w:jc w:val="left"/>
               <w:rPr>
-                <w:bCs/>
+                <w:b/>
                 <w:sz w:val="32"/>
                 <w:szCs w:val="32"/>
               </w:rPr>
             </w:pPr>
             <w:r>
               <w:rPr>
-                <w:bCs/>
+                <w:b/>
                 <w:sz w:val="32"/>
                 <w:szCs w:val="32"/>
               </w:rPr>
@@ -736,7 +596,7 @@
             </w:r>
             <w:r>
               <w:rPr>
-                <w:bCs/>
+                <w:b/>
                 <w:sz w:val="32"/>
                 <w:szCs w:val="32"/>
               </w:rPr>
@@ -745,7 +605,7 @@
             <w:proofErr w:type="spellStart"/>
             <w:r>
               <w:rPr>
-                <w:bCs/>
+                <w:b/>
                 <w:sz w:val="32"/>
                 <w:szCs w:val="32"/>
               </w:rPr>
@@ -754,7 +614,7 @@
             <w:proofErr w:type="spellEnd"/>
             <w:r>
               <w:rPr>
-                <w:bCs/>
+                <w:b/>
                 <w:sz w:val="32"/>
                 <w:szCs w:val="32"/>
               </w:rPr>
@@ -762,46 +622,14 @@
             </w:r>
             <w:r>
               <w:rPr>
-                <w:bCs/>
+                <w:b/>
                 <w:sz w:val="32"/>
                 <w:szCs w:val="32"/>
               </w:rPr>
-              <w:t xml:space="preserve"> e exibe o valor estimado</w:t>
-            </w:r>
-            <w:r>
-              <w:rPr>
-                <w:bCs/>
-                <w:sz w:val="32"/>
-                <w:szCs w:val="32"/>
-              </w:rPr>
-              <w:t xml:space="preserve"> (</w:t>
-            </w:r>
-            <w:r>
-              <w:rPr>
-                <w:bCs/>
-                <w:color w:val="FF0000"/>
-                <w:sz w:val="32"/>
-                <w:szCs w:val="32"/>
-              </w:rPr>
-              <w:t>Tela_07</w:t>
-            </w:r>
-            <w:r>
-              <w:rPr>
-                <w:bCs/>
-                <w:sz w:val="32"/>
-                <w:szCs w:val="32"/>
-              </w:rPr>
-              <w:t>)</w:t>
-            </w:r>
-            <w:r>
-              <w:rPr>
-                <w:bCs/>
-                <w:sz w:val="32"/>
-                <w:szCs w:val="32"/>
-              </w:rPr>
-              <w:t>.</w:t>
-            </w:r>
-          </w:p>
+              <w:t xml:space="preserve"> e exibe o valor estimado.</w:t>
+            </w:r>
+          </w:p>
+          <w:p/>
           <w:p>
             <w:pPr>
               <w:pStyle w:val="Ttulo2"/>
@@ -811,53 +639,29 @@
               </w:numPr>
               <w:jc w:val="left"/>
               <w:rPr>
-                <w:bCs/>
+                <w:b/>
                 <w:sz w:val="32"/>
                 <w:szCs w:val="32"/>
               </w:rPr>
             </w:pPr>
             <w:r>
               <w:rPr>
-                <w:bCs/>
+                <w:b/>
                 <w:sz w:val="32"/>
                 <w:szCs w:val="32"/>
               </w:rPr>
-              <w:t xml:space="preserve"> Solicitante confirma a solicitação</w:t>
-            </w:r>
-            <w:r>
-              <w:rPr>
-                <w:bCs/>
+              <w:t xml:space="preserve"> </w:t>
+            </w:r>
+            <w:r>
+              <w:rPr>
+                <w:b/>
                 <w:sz w:val="32"/>
                 <w:szCs w:val="32"/>
               </w:rPr>
-              <w:t xml:space="preserve"> (</w:t>
-            </w:r>
-            <w:r>
-              <w:rPr>
-                <w:bCs/>
-                <w:color w:val="FF0000"/>
-                <w:sz w:val="32"/>
-                <w:szCs w:val="32"/>
-              </w:rPr>
-              <w:t>Tela_07</w:t>
-            </w:r>
-            <w:r>
-              <w:rPr>
-                <w:bCs/>
-                <w:sz w:val="32"/>
-                <w:szCs w:val="32"/>
-              </w:rPr>
-              <w:t>)</w:t>
-            </w:r>
-            <w:r>
-              <w:rPr>
-                <w:bCs/>
-                <w:sz w:val="32"/>
-                <w:szCs w:val="32"/>
-              </w:rPr>
-              <w:t>.</w:t>
-            </w:r>
-          </w:p>
+              <w:t>Solicitante confirma a solicitação.</w:t>
+            </w:r>
+          </w:p>
+          <w:p/>
           <w:p>
             <w:pPr>
               <w:pStyle w:val="Ttulo2"/>
@@ -867,53 +671,21 @@
               </w:numPr>
               <w:jc w:val="left"/>
               <w:rPr>
-                <w:bCs/>
+                <w:b/>
                 <w:sz w:val="32"/>
                 <w:szCs w:val="32"/>
               </w:rPr>
             </w:pPr>
             <w:r>
               <w:rPr>
-                <w:bCs/>
+                <w:b/>
                 <w:sz w:val="32"/>
                 <w:szCs w:val="32"/>
               </w:rPr>
-              <w:t>Sistema salva a solicitação com status “Aguardando Entregador”</w:t>
-            </w:r>
-            <w:r>
-              <w:rPr>
-                <w:bCs/>
-                <w:sz w:val="32"/>
-                <w:szCs w:val="32"/>
-              </w:rPr>
-              <w:t xml:space="preserve"> (</w:t>
-            </w:r>
-            <w:r>
-              <w:rPr>
-                <w:bCs/>
-                <w:color w:val="FF0000"/>
-                <w:sz w:val="32"/>
-                <w:szCs w:val="32"/>
-              </w:rPr>
-              <w:t>Tela_08</w:t>
-            </w:r>
-            <w:r>
-              <w:rPr>
-                <w:bCs/>
-                <w:sz w:val="32"/>
-                <w:szCs w:val="32"/>
-              </w:rPr>
-              <w:t>)</w:t>
-            </w:r>
-            <w:r>
-              <w:rPr>
-                <w:bCs/>
-                <w:sz w:val="32"/>
-                <w:szCs w:val="32"/>
-              </w:rPr>
-              <w:t>.</w:t>
-            </w:r>
-          </w:p>
+              <w:t>Sistema salva a solicitação com status “Aguardando Entregador”.</w:t>
+            </w:r>
+          </w:p>
+          <w:p/>
           <w:p>
             <w:pPr>
               <w:pStyle w:val="Ttulo2"/>
@@ -923,68 +695,18 @@
               </w:numPr>
               <w:jc w:val="left"/>
               <w:rPr>
-                <w:bCs/>
+                <w:b/>
                 <w:sz w:val="32"/>
                 <w:szCs w:val="32"/>
               </w:rPr>
             </w:pPr>
             <w:r>
               <w:rPr>
-                <w:bCs/>
+                <w:b/>
                 <w:sz w:val="32"/>
                 <w:szCs w:val="32"/>
               </w:rPr>
-              <w:t>Sistema exibe confirmação</w:t>
-            </w:r>
-            <w:r>
-              <w:rPr>
-                <w:bCs/>
-                <w:sz w:val="32"/>
-                <w:szCs w:val="32"/>
-              </w:rPr>
-              <w:t xml:space="preserve"> </w:t>
-            </w:r>
-            <w:r>
-              <w:rPr>
-                <w:bCs/>
-                <w:sz w:val="32"/>
-                <w:szCs w:val="32"/>
-              </w:rPr>
-              <w:t>(</w:t>
-            </w:r>
-            <w:r>
-              <w:rPr>
-                <w:bCs/>
-                <w:color w:val="FF0000"/>
-                <w:sz w:val="32"/>
-                <w:szCs w:val="32"/>
-              </w:rPr>
-              <w:t>Tela_0</w:t>
-            </w:r>
-            <w:r>
-              <w:rPr>
-                <w:bCs/>
-                <w:color w:val="FF0000"/>
-                <w:sz w:val="32"/>
-                <w:szCs w:val="32"/>
-              </w:rPr>
-              <w:t>9</w:t>
-            </w:r>
-            <w:r>
-              <w:rPr>
-                <w:bCs/>
-                <w:sz w:val="32"/>
-                <w:szCs w:val="32"/>
-              </w:rPr>
-              <w:t>)</w:t>
-            </w:r>
-            <w:r>
-              <w:rPr>
-                <w:bCs/>
-                <w:sz w:val="32"/>
-                <w:szCs w:val="32"/>
-              </w:rPr>
-              <w:t>.</w:t>
+              <w:t>Sistema exibe confirmação.</w:t>
             </w:r>
           </w:p>
           <w:p/>
@@ -1040,134 +762,123 @@
             </w:tcBorders>
           </w:tcPr>
           <w:p>
-            <w:pPr>
-              <w:rPr>
+            <w:r>
+              <w:rPr>
+                <w:rFonts w:hAnsi="Symbol"/>
+              </w:rPr>
+              <w:t></w:t>
+            </w:r>
+            <w:r>
+              <w:t xml:space="preserve">  </w:t>
+            </w:r>
+            <w:r>
+              <w:rPr>
+                <w:rStyle w:val="Forte"/>
+              </w:rPr>
+              <w:t xml:space="preserve">A1 — </w:t>
+            </w:r>
+            <w:r>
+              <w:rPr>
+                <w:rStyle w:val="Forte"/>
+                <w:sz w:val="28"/>
+                <w:szCs w:val="28"/>
+              </w:rPr>
+              <w:t>Alterar:</w:t>
+            </w:r>
+            <w:r>
+              <w:rPr>
+                <w:sz w:val="28"/>
+                <w:szCs w:val="28"/>
+              </w:rPr>
+              <w:t xml:space="preserve"> no passo 1, Solicitante escolhe "Editar"</w:t>
+            </w:r>
+            <w:r>
+              <w:t xml:space="preserve"> </w:t>
+            </w:r>
+            <w:r>
+              <w:rPr>
+                <w:sz w:val="28"/>
+                <w:szCs w:val="28"/>
+              </w:rPr>
+              <w:t>em vez de "Nova"; sistema carrega dados existentes; segue do passo 2. Só permitido se status = "Aguardando Entregador" (ainda não aceita).</w:t>
+            </w:r>
+            <w:r>
+              <w:t xml:space="preserve"> </w:t>
+            </w:r>
+          </w:p>
+          <w:p>
+            <w:pPr>
+              <w:pStyle w:val="Ttulo2"/>
+              <w:rPr>
+                <w:b/>
+              </w:rPr>
+            </w:pPr>
+            <w:r>
+              <w:rPr>
+                <w:rFonts w:hAnsi="Symbol"/>
+              </w:rPr>
+              <w:t></w:t>
+            </w:r>
+            <w:r>
+              <w:t xml:space="preserve">  </w:t>
+            </w:r>
+            <w:r>
+              <w:rPr>
+                <w:rStyle w:val="Forte"/>
+              </w:rPr>
+              <w:t>A2 — Cancelar (</w:t>
+            </w:r>
+            <w:r>
+              <w:rPr>
+                <w:rStyle w:val="CdigoHTML"/>
                 <w:b/>
                 <w:bCs/>
-                <w:sz w:val="28"/>
-                <w:szCs w:val="28"/>
-              </w:rPr>
-            </w:pPr>
-            <w:r>
-              <w:rPr>
-                <w:rFonts w:hAnsi="Symbol"/>
-              </w:rPr>
-              <w:t></w:t>
-            </w:r>
-            <w:r>
-              <w:t xml:space="preserve"> </w:t>
-            </w:r>
+              </w:rPr>
+              <w:t>«</w:t>
+            </w:r>
+            <w:proofErr w:type="spellStart"/>
+            <w:r>
+              <w:rPr>
+                <w:rStyle w:val="CdigoHTML"/>
+                <w:b/>
+                <w:bCs/>
+              </w:rPr>
+              <w:t>extend</w:t>
+            </w:r>
+            <w:proofErr w:type="spellEnd"/>
+            <w:r>
+              <w:rPr>
+                <w:rStyle w:val="CdigoHTML"/>
+                <w:b/>
+                <w:bCs/>
+              </w:rPr>
+              <w:t xml:space="preserve">» </w:t>
+            </w:r>
+            <w:proofErr w:type="spellStart"/>
+            <w:r>
+              <w:rPr>
+                <w:rStyle w:val="CdigoHTML"/>
+                <w:b/>
+                <w:bCs/>
+              </w:rPr>
+              <w:t>CancelarSolicitacao</w:t>
+            </w:r>
+            <w:proofErr w:type="spellEnd"/>
             <w:r>
               <w:rPr>
                 <w:rStyle w:val="Forte"/>
-                <w:sz w:val="28"/>
-                <w:szCs w:val="28"/>
-              </w:rPr>
-              <w:t>Linha 1:</w:t>
-            </w:r>
-            <w:r>
-              <w:rPr>
-                <w:rStyle w:val="Forte"/>
-              </w:rPr>
-              <w:t xml:space="preserve"> </w:t>
-            </w:r>
-            <w:r>
-              <w:rPr>
-                <w:rStyle w:val="Forte"/>
-                <w:b w:val="0"/>
-                <w:bCs w:val="0"/>
-                <w:sz w:val="28"/>
-                <w:szCs w:val="28"/>
-              </w:rPr>
-              <w:t>Solicitante clica em ‘Editar’ e não em ‘Nova solicitação</w:t>
-            </w:r>
-            <w:proofErr w:type="gramStart"/>
-            <w:r>
-              <w:rPr>
-                <w:rStyle w:val="Forte"/>
-                <w:b w:val="0"/>
-                <w:bCs w:val="0"/>
-                <w:sz w:val="28"/>
-                <w:szCs w:val="28"/>
-              </w:rPr>
-              <w:t>’ .</w:t>
-            </w:r>
-            <w:proofErr w:type="gramEnd"/>
-            <w:r>
-              <w:rPr>
-                <w:rStyle w:val="Forte"/>
-                <w:b w:val="0"/>
-                <w:bCs w:val="0"/>
-                <w:sz w:val="28"/>
-                <w:szCs w:val="28"/>
-              </w:rPr>
-              <w:t xml:space="preserve"> O sistema carrega endereço salvo e segue a partir da linha 2. Somente permitido se status = “Aguardando Entregador”</w:t>
-            </w:r>
-            <w:r>
-              <w:rPr>
-                <w:rStyle w:val="Forte"/>
-                <w:b w:val="0"/>
-                <w:bCs w:val="0"/>
-                <w:sz w:val="28"/>
-                <w:szCs w:val="28"/>
-              </w:rPr>
-              <w:t>.</w:t>
-            </w:r>
-          </w:p>
-          <w:p>
-            <w:pPr>
-              <w:pStyle w:val="Ttulo2"/>
-              <w:jc w:val="left"/>
-              <w:rPr>
-                <w:b/>
-                <w:bCs/>
-              </w:rPr>
-            </w:pPr>
-            <w:r>
-              <w:rPr>
-                <w:rFonts w:hAnsi="Symbol"/>
-                <w:sz w:val="24"/>
-                <w:szCs w:val="24"/>
-              </w:rPr>
-              <w:t></w:t>
-            </w:r>
-            <w:r>
-              <w:rPr>
-                <w:b/>
-                <w:bCs/>
-              </w:rPr>
-              <w:t xml:space="preserve"> </w:t>
-            </w:r>
-            <w:r>
-              <w:rPr>
-                <w:rStyle w:val="Forte"/>
-              </w:rPr>
-              <w:t>Linha 6</w:t>
-            </w:r>
-            <w:r>
-              <w:rPr>
-                <w:rStyle w:val="Forte"/>
-                <w:b w:val="0"/>
-                <w:bCs w:val="0"/>
-              </w:rPr>
-              <w:t xml:space="preserve">: Solicitante cancela antes da entrega ser concluída. Se já houve pagamento, acione </w:t>
+              </w:rPr>
+              <w:t>):</w:t>
+            </w:r>
+            <w:r>
+              <w:t xml:space="preserve"> disparado a qualquer momento antes da entrega ser concluída; se já houve pagamento, aciona </w:t>
             </w:r>
             <w:proofErr w:type="spellStart"/>
             <w:r>
-              <w:rPr>
-                <w:rStyle w:val="Forte"/>
-                <w:b w:val="0"/>
-                <w:bCs w:val="0"/>
-              </w:rPr>
               <w:t>EstornarPagamento</w:t>
             </w:r>
             <w:proofErr w:type="spellEnd"/>
             <w:r>
-              <w:rPr>
-                <w:rStyle w:val="Forte"/>
-                <w:b w:val="0"/>
-                <w:bCs w:val="0"/>
-              </w:rPr>
               <w:t>.</w:t>
             </w:r>
           </w:p>
@@ -1236,77 +947,57 @@
               <w:t></w:t>
             </w:r>
             <w:r>
+              <w:t xml:space="preserve">  </w:t>
+            </w:r>
+            <w:r>
+              <w:rPr>
+                <w:rStyle w:val="Forte"/>
+                <w:sz w:val="28"/>
+                <w:szCs w:val="28"/>
+              </w:rPr>
+              <w:t>E1:</w:t>
+            </w:r>
+            <w:r>
+              <w:rPr>
+                <w:sz w:val="28"/>
+                <w:szCs w:val="28"/>
+              </w:rPr>
+              <w:t xml:space="preserve"> endereço inválido → sistema exibe erro, retorna ao passo 3 </w:t>
+            </w:r>
+          </w:p>
+          <w:p>
+            <w:r>
+              <w:rPr>
+                <w:rFonts w:hAnsi="Symbol"/>
+                <w:sz w:val="28"/>
+                <w:szCs w:val="28"/>
+              </w:rPr>
+              <w:t></w:t>
+            </w:r>
+            <w:r>
+              <w:rPr>
+                <w:sz w:val="28"/>
+                <w:szCs w:val="28"/>
+              </w:rPr>
+              <w:t xml:space="preserve">  </w:t>
+            </w:r>
+            <w:r>
+              <w:rPr>
+                <w:rStyle w:val="Forte"/>
+                <w:sz w:val="28"/>
+                <w:szCs w:val="28"/>
+              </w:rPr>
+              <w:t>E2:</w:t>
+            </w:r>
+            <w:r>
+              <w:rPr>
+                <w:sz w:val="28"/>
+                <w:szCs w:val="28"/>
+              </w:rPr>
+              <w:t xml:space="preserve"> falha ao calcular frete (serviço externo indisponível) → sistema informa erro, permite tentar novamente ou salvar como rascunho</w:t>
+            </w:r>
+            <w:r>
               <w:t xml:space="preserve"> </w:t>
-            </w:r>
-            <w:r>
-              <w:rPr>
-                <w:rStyle w:val="Forte"/>
-                <w:sz w:val="28"/>
-                <w:szCs w:val="28"/>
-              </w:rPr>
-              <w:t>Linha 4</w:t>
-            </w:r>
-            <w:r>
-              <w:rPr>
-                <w:rStyle w:val="Forte"/>
-                <w:sz w:val="28"/>
-                <w:szCs w:val="28"/>
-              </w:rPr>
-              <w:t>:</w:t>
-            </w:r>
-            <w:r>
-              <w:rPr>
-                <w:sz w:val="28"/>
-                <w:szCs w:val="28"/>
-              </w:rPr>
-              <w:t xml:space="preserve"> endereço inválido → sistema exibe erro, retorna ao passo 3</w:t>
-            </w:r>
-            <w:r>
-              <w:rPr>
-                <w:sz w:val="28"/>
-                <w:szCs w:val="28"/>
-              </w:rPr>
-              <w:t>.</w:t>
-            </w:r>
-          </w:p>
-          <w:p>
-            <w:r>
-              <w:rPr>
-                <w:rFonts w:hAnsi="Symbol"/>
-              </w:rPr>
-              <w:t></w:t>
-            </w:r>
-            <w:r>
-              <w:rPr>
-                <w:rFonts w:hAnsi="Symbol"/>
-              </w:rPr>
-              <w:t xml:space="preserve"> </w:t>
-            </w:r>
-            <w:r>
-              <w:rPr>
-                <w:rStyle w:val="Forte"/>
-                <w:sz w:val="28"/>
-                <w:szCs w:val="28"/>
-              </w:rPr>
-              <w:t>Linha 4</w:t>
-            </w:r>
-            <w:r>
-              <w:rPr>
-                <w:rStyle w:val="Forte"/>
-                <w:sz w:val="28"/>
-                <w:szCs w:val="28"/>
-              </w:rPr>
-              <w:t>:</w:t>
-            </w:r>
-            <w:r>
-              <w:rPr>
-                <w:sz w:val="28"/>
-                <w:szCs w:val="28"/>
-              </w:rPr>
-              <w:t xml:space="preserve"> falha ao calcular frete (serviço externo indisponível) → sistema informa erro, permite tentar novamente ou salvar como rascunho</w:t>
-            </w:r>
-            <w:r>
-              <w:t>.</w:t>
             </w:r>
           </w:p>
         </w:tc>
@@ -1523,6 +1214,7 @@
               <w:jc w:val="center"/>
             </w:pPr>
             <w:r>
+              <w:lastRenderedPageBreak/>
               <w:t>19/12/2014</w:t>
             </w:r>
           </w:p>
@@ -1720,7 +1412,7 @@
 </file>
 
 <file path=word/numbering.xml><?xml version="1.0" encoding="utf-8"?>
-<w:numbering xmlns:wpc="http://schemas.microsoft.com/office/word/2010/wordprocessingCanvas" xmlns:cx="http://schemas.microsoft.com/office/drawing/2014/chartex" xmlns:cx1="http://schemas.microsoft.com/office/drawing/2015/9/8/chartex" xmlns:cx2="http://schemas.microsoft.com/office/drawing/2015/10/21/chartex" xmlns:cx3="http://schemas.microsoft.com/office/drawing/2016/5/9/chartex" xmlns:cx4="http://schemas.microsoft.com/office/drawing/2016/5/10/chartex" xmlns:cx5="http://schemas.microsoft.com/office/drawing/2016/5/11/chartex" xmlns:cx6="http://schemas.microsoft.com/office/drawing/2016/5/12/chartex" xmlns:cx7="http://schemas.microsoft.com/office/drawing/2016/5/13/chartex" xmlns:cx8="http://schemas.microsoft.com/office/drawing/2016/5/14/chartex" xmlns:mc="http://schemas.openxmlformats.org/markup-compatibility/2006" xmlns:aink="http://schemas.microsoft.com/office/drawing/2016/ink" xmlns:am3d="http://schemas.microsoft.com/office/drawing/2017/model3d" xmlns:o="urn:schemas-microsoft-com:office:office" xmlns:oel="http://schemas.microsoft.com/office/2019/extlst" xmlns:r="http://schemas.openxmlformats.org/officeDocument/2006/relationships" xmlns:m="http://schemas.openxmlformats.org/officeDocument/2006/math" xmlns:v="urn:schemas-microsoft-com:vml" xmlns:wp14="http://schemas.microsoft.com/office/word/2010/wordprocessingDrawing" xmlns:wp="http://schemas.openxmlformats.org/drawingml/2006/wordprocessingDrawing" xmlns:w10="urn:schemas-microsoft-com:office:word" xmlns:w="http://schemas.openxmlformats.org/wordprocessingml/2006/main" xmlns:w14="http://schemas.microsoft.com/office/word/2010/wordml" xmlns:w15="http://schemas.microsoft.com/office/word/2012/wordml" xmlns:w16cex="http://schemas.microsoft.com/office/word/2018/wordml/cex" xmlns:w16cid="http://schemas.microsoft.com/office/word/2016/wordml/cid" xmlns:w16="http://schemas.microsoft.com/office/word/2018/wordml" xmlns:w16sdtdh="http://schemas.microsoft.com/office/word/2020/wordml/sdtdatahash" xmlns:w16se="http://schemas.microsoft.com/office/word/2015/wordml/symex" xmlns:wpg="http://schemas.microsoft.com/office/word/2010/wordprocessingGroup" xmlns:wpi="http://schemas.microsoft.com/office/word/2010/wordprocessingInk" xmlns:wne="http://schemas.microsoft.com/office/word/2006/wordml" xmlns:wps="http://schemas.microsoft.com/office/word/2010/wordprocessingShape" mc:Ignorable="w14 w15 w16se w16cid w16 w16cex w16sdtdh wp14">
+<w:numbering xmlns:wpc="http://schemas.microsoft.com/office/word/2010/wordprocessingCanvas" xmlns:cx="http://schemas.microsoft.com/office/drawing/2014/chartex" xmlns:cx1="http://schemas.microsoft.com/office/drawing/2015/9/8/chartex" xmlns:cx2="http://schemas.microsoft.com/office/drawing/2015/10/21/chartex" xmlns:cx3="http://schemas.microsoft.com/office/drawing/2016/5/9/chartex" xmlns:cx4="http://schemas.microsoft.com/office/drawing/2016/5/10/chartex" xmlns:cx5="http://schemas.microsoft.com/office/drawing/2016/5/11/chartex" xmlns:cx6="http://schemas.microsoft.com/office/drawing/2016/5/12/chartex" xmlns:cx7="http://schemas.microsoft.com/office/drawing/2016/5/13/chartex" xmlns:cx8="http://schemas.microsoft.com/office/drawing/2016/5/14/chartex" xmlns:mc="http://schemas.openxmlformats.org/markup-compatibility/2006" xmlns:aink="http://schemas.microsoft.com/office/drawing/2016/ink" xmlns:am3d="http://schemas.microsoft.com/office/drawing/2017/model3d" xmlns:o="urn:schemas-microsoft-com:office:office" xmlns:oel="http://schemas.microsoft.com/office/2019/extlst" xmlns:r="http://schemas.openxmlformats.org/officeDocument/2006/relationships" xmlns:m="http://schemas.openxmlformats.org/officeDocument/2006/math" xmlns:v="urn:schemas-microsoft-com:vml" xmlns:wp14="http://schemas.microsoft.com/office/word/2010/wordprocessingDrawing" xmlns:wp="http://schemas.openxmlformats.org/drawingml/2006/wordprocessingDrawing" xmlns:w10="urn:schemas-microsoft-com:office:word" xmlns:w="http://schemas.openxmlformats.org/wordprocessingml/2006/main" xmlns:w14="http://schemas.microsoft.com/office/word/2010/wordml" xmlns:w15="http://schemas.microsoft.com/office/word/2012/wordml" xmlns:w16cex="http://schemas.microsoft.com/office/word/2018/wordml/cex" xmlns:w16cid="http://schemas.microsoft.com/office/word/2016/wordml/cid" xmlns:w16="http://schemas.microsoft.com/office/word/2018/wordml" xmlns:w16du="http://schemas.microsoft.com/office/word/2023/wordml/word16du" xmlns:w16sdtdh="http://schemas.microsoft.com/office/word/2020/wordml/sdtdatahash" xmlns:w16sdtfl="http://schemas.microsoft.com/office/word/2024/wordml/sdtformatlock" xmlns:w16se="http://schemas.microsoft.com/office/word/2015/wordml/symex" xmlns:wpg="http://schemas.microsoft.com/office/word/2010/wordprocessingGroup" xmlns:wpi="http://schemas.microsoft.com/office/word/2010/wordprocessingInk" xmlns:wne="http://schemas.microsoft.com/office/word/2006/wordml" xmlns:wps="http://schemas.microsoft.com/office/word/2010/wordprocessingShape" mc:Ignorable="w14 w15 w16se w16cid w16 w16cex w16sdtdh w16sdtfl w16du wp14">
   <w:abstractNum w:abstractNumId="0" w15:restartNumberingAfterBreak="0">
     <w:nsid w:val="0145720D"/>
     <w:multiLevelType w:val="singleLevel"/>
@@ -2032,7 +1724,7 @@
       </w:pPr>
     </w:lvl>
   </w:abstractNum>
-  <w:num w:numId="1" w16cid:durableId="285627451">
+  <w:num w:numId="1" w16cid:durableId="1144617304">
     <w:abstractNumId w:val="2"/>
     <w:lvlOverride w:ilvl="0">
       <w:startOverride w:val="1"/>
@@ -2062,7 +1754,7 @@
       <w:startOverride w:val="1"/>
     </w:lvlOverride>
   </w:num>
-  <w:num w:numId="2" w16cid:durableId="233273896">
+  <w:num w:numId="2" w16cid:durableId="324629815">
     <w:abstractNumId w:val="1"/>
     <w:lvlOverride w:ilvl="0">
       <w:startOverride w:val="3"/>
@@ -2092,20 +1784,20 @@
       <w:startOverride w:val="1"/>
     </w:lvlOverride>
   </w:num>
-  <w:num w:numId="3" w16cid:durableId="1827740991">
+  <w:num w:numId="3" w16cid:durableId="119955865">
     <w:abstractNumId w:val="0"/>
   </w:num>
-  <w:num w:numId="4" w16cid:durableId="98641828">
+  <w:num w:numId="4" w16cid:durableId="320622015">
     <w:abstractNumId w:val="1"/>
   </w:num>
-  <w:num w:numId="5" w16cid:durableId="1988433466">
+  <w:num w:numId="5" w16cid:durableId="1379092021">
     <w:abstractNumId w:val="3"/>
   </w:num>
 </w:numbering>
 </file>
 
 <file path=word/styles.xml><?xml version="1.0" encoding="utf-8"?>
-<w:styles xmlns:mc="http://schemas.openxmlformats.org/markup-compatibility/2006" xmlns:r="http://schemas.openxmlformats.org/officeDocument/2006/relationships" xmlns:w="http://schemas.openxmlformats.org/wordprocessingml/2006/main" xmlns:w14="http://schemas.microsoft.com/office/word/2010/wordml" xmlns:w15="http://schemas.microsoft.com/office/word/2012/wordml" xmlns:w16cex="http://schemas.microsoft.com/office/word/2018/wordml/cex" xmlns:w16cid="http://schemas.microsoft.com/office/word/2016/wordml/cid" xmlns:w16="http://schemas.microsoft.com/office/word/2018/wordml" xmlns:w16sdtdh="http://schemas.microsoft.com/office/word/2020/wordml/sdtdatahash" xmlns:w16se="http://schemas.microsoft.com/office/word/2015/wordml/symex" mc:Ignorable="w14 w15 w16se w16cid w16 w16cex w16sdtdh">
+<w:styles xmlns:mc="http://schemas.openxmlformats.org/markup-compatibility/2006" xmlns:r="http://schemas.openxmlformats.org/officeDocument/2006/relationships" xmlns:w="http://schemas.openxmlformats.org/wordprocessingml/2006/main" xmlns:w14="http://schemas.microsoft.com/office/word/2010/wordml" xmlns:w15="http://schemas.microsoft.com/office/word/2012/wordml" xmlns:w16cex="http://schemas.microsoft.com/office/word/2018/wordml/cex" xmlns:w16cid="http://schemas.microsoft.com/office/word/2016/wordml/cid" xmlns:w16="http://schemas.microsoft.com/office/word/2018/wordml" xmlns:w16du="http://schemas.microsoft.com/office/word/2023/wordml/word16du" xmlns:w16sdtdh="http://schemas.microsoft.com/office/word/2020/wordml/sdtdatahash" xmlns:w16sdtfl="http://schemas.microsoft.com/office/word/2024/wordml/sdtformatlock" xmlns:w16se="http://schemas.microsoft.com/office/word/2015/wordml/symex" mc:Ignorable="w14 w15 w16se w16cid w16 w16cex w16sdtdh w16sdtfl w16du">
   <w:docDefaults>
     <w:rPrDefault>
       <w:rPr>

</xml_diff>